<commit_message>
Update Self Balancing Robot v1.docx
</commit_message>
<xml_diff>
--- a/Self Balancing Robot v1.docx
+++ b/Self Balancing Robot v1.docx
@@ -892,7 +892,6 @@
         </w:rPr>
       </w:pPr>
       <w:hyperlink r:id="rId9" w:history="1">
-        <w:proofErr w:type="spellStart"/>
         <w:r>
           <w:rPr>
             <w:rStyle w:val="Hyperlink"/>
@@ -900,7 +899,6 @@
           </w:rPr>
           <w:t>Communica</w:t>
         </w:r>
-        <w:proofErr w:type="spellEnd"/>
       </w:hyperlink>
       <w:r>
         <w:t xml:space="preserve"> (Paarden Eiland)</w:t>
@@ -942,19 +940,11 @@
         </w:rPr>
       </w:pPr>
       <w:hyperlink r:id="rId11" w:history="1">
-        <w:proofErr w:type="spellStart"/>
         <w:r>
           <w:rPr>
             <w:rStyle w:val="Hyperlink"/>
           </w:rPr>
-          <w:t>DigiKey</w:t>
-        </w:r>
-        <w:proofErr w:type="spellEnd"/>
-        <w:r>
-          <w:rPr>
-            <w:rStyle w:val="Hyperlink"/>
-          </w:rPr>
-          <w:t xml:space="preserve"> South Africa</w:t>
+          <w:t>DigiKey South Africa</w:t>
         </w:r>
       </w:hyperlink>
       <w:r>
@@ -1471,41 +1461,59 @@
     </w:tbl>
     <w:p>
       <w:pPr>
-        <w:rPr>
-          <w:lang w:val="en-GB"/>
-        </w:rPr>
-      </w:pPr>
-    </w:p>
-    <w:p>
-      <w:pPr>
-        <w:rPr>
-          <w:lang w:val="en-GB"/>
-        </w:rPr>
-      </w:pPr>
-    </w:p>
-    <w:p>
-      <w:pPr>
-        <w:rPr>
-          <w:lang w:val="en-GB"/>
-        </w:rPr>
-      </w:pPr>
-    </w:p>
-    <w:p>
-      <w:pPr>
-        <w:rPr>
-          <w:lang w:val="en-GB"/>
-        </w:rPr>
-      </w:pPr>
-    </w:p>
-    <w:p>
-      <w:pPr>
-        <w:rPr>
-          <w:lang w:val="en-GB"/>
-        </w:rPr>
-      </w:pPr>
-    </w:p>
-    <w:p>
-      <w:pPr>
+        <w:tabs>
+          <w:tab w:val="left" w:pos="2680"/>
+        </w:tabs>
+        <w:rPr>
+          <w:lang w:val="en-GB"/>
+        </w:rPr>
+      </w:pPr>
+    </w:p>
+    <w:p>
+      <w:pPr>
+        <w:tabs>
+          <w:tab w:val="left" w:pos="2680"/>
+        </w:tabs>
+        <w:rPr>
+          <w:lang w:val="en-GB"/>
+        </w:rPr>
+      </w:pPr>
+    </w:p>
+    <w:p>
+      <w:pPr>
+        <w:tabs>
+          <w:tab w:val="left" w:pos="2680"/>
+        </w:tabs>
+        <w:rPr>
+          <w:lang w:val="en-GB"/>
+        </w:rPr>
+      </w:pPr>
+    </w:p>
+    <w:p>
+      <w:pPr>
+        <w:tabs>
+          <w:tab w:val="left" w:pos="2680"/>
+        </w:tabs>
+        <w:rPr>
+          <w:lang w:val="en-GB"/>
+        </w:rPr>
+      </w:pPr>
+    </w:p>
+    <w:p>
+      <w:pPr>
+        <w:tabs>
+          <w:tab w:val="left" w:pos="2680"/>
+        </w:tabs>
+        <w:rPr>
+          <w:lang w:val="en-GB"/>
+        </w:rPr>
+      </w:pPr>
+    </w:p>
+    <w:p>
+      <w:pPr>
+        <w:tabs>
+          <w:tab w:val="left" w:pos="2680"/>
+        </w:tabs>
         <w:rPr>
           <w:lang w:val="en-GB"/>
         </w:rPr>
@@ -1517,6 +1525,9 @@
           <w:top w:val="double" w:sz="6" w:space="1" w:color="auto"/>
           <w:bottom w:val="double" w:sz="6" w:space="1" w:color="auto"/>
         </w:pBdr>
+        <w:tabs>
+          <w:tab w:val="left" w:pos="2680"/>
+        </w:tabs>
         <w:rPr>
           <w:b/>
           <w:bCs/>
@@ -1530,7 +1541,7 @@
           <w:lang w:val="en-GB"/>
         </w:rPr>
         <w:lastRenderedPageBreak/>
-        <w:t>V</w:t>
+        <w:t xml:space="preserve">VERSION </w:t>
       </w:r>
       <w:r>
         <w:rPr>
@@ -1538,15 +1549,7 @@
           <w:bCs/>
           <w:lang w:val="en-GB"/>
         </w:rPr>
-        <w:t>ERSION</w:t>
-      </w:r>
-      <w:r>
-        <w:rPr>
-          <w:b/>
-          <w:bCs/>
-          <w:lang w:val="en-GB"/>
-        </w:rPr>
-        <w:t xml:space="preserve"> 1</w:t>
+        <w:t>1</w:t>
       </w:r>
     </w:p>
     <w:p>
@@ -1677,21 +1680,7 @@
         <w:rPr>
           <w:lang w:val="en-GB"/>
         </w:rPr>
-        <w:t xml:space="preserve"> - </w:t>
-      </w:r>
-      <w:proofErr w:type="spellStart"/>
-      <w:r>
-        <w:rPr>
-          <w:lang w:val="en-GB"/>
-        </w:rPr>
-        <w:t>Communica</w:t>
-      </w:r>
-      <w:proofErr w:type="spellEnd"/>
-      <w:r>
-        <w:rPr>
-          <w:lang w:val="en-GB"/>
-        </w:rPr>
-        <w:t xml:space="preserve"> link</w:t>
+        <w:t xml:space="preserve"> - Communica link</w:t>
       </w:r>
       <w:r>
         <w:rPr>
@@ -1787,13 +1776,7 @@
         <w:rPr>
           <w:lang w:val="en-GB"/>
         </w:rPr>
-        <w:t>L298N Dual H-Bridge</w:t>
-      </w:r>
-      <w:r>
-        <w:rPr>
-          <w:lang w:val="en-GB"/>
-        </w:rPr>
-        <w:t>.</w:t>
+        <w:t>DRV8833 (see link below).</w:t>
       </w:r>
     </w:p>
     <w:p>
@@ -1813,17 +1796,14 @@
             <w:rStyle w:val="Hyperlink"/>
             <w:lang w:val="en-GB"/>
           </w:rPr>
-          <w:t>https://youtu.be/1bxwINoBz8M?si=n8Yrparx3H1zSFY7</w:t>
+          <w:t>https://www.communica.co.za/products/hkd-ramps-stepper-driver-drv8833?variant=40351922618441&amp;sfdr_ptcid=31591_617_692972130&amp;sfdr_hash=f1fc32f8c8e4b23f0e60c33591a415d0&amp;utm_source=www.communica.co.za&amp;gad_source=1&amp;gad_campaignid=22552818411&amp;gbraid=0AAAAADLTnIZTVU6Cje37BAAegSC4YUWFZ&amp;gclid=CjwKCAjw8arQBhB9EiwAfIKdQvWFYp-EkF1O7b7p8GFMhgPHTlYBra40T-tZbtKAcBej18Wki_dD6hoCPh4QAvD_BwE</w:t>
         </w:r>
       </w:hyperlink>
       <w:r>
-        <w:t>.</w:t>
-      </w:r>
-      <w:r>
-        <w:rPr>
-          <w:lang w:val="en-GB"/>
-        </w:rPr>
-        <w:t xml:space="preserve"> </w:t>
+        <w:rPr>
+          <w:lang w:val="en-GB"/>
+        </w:rPr>
+        <w:t xml:space="preserve">. </w:t>
       </w:r>
     </w:p>
     <w:p>
@@ -1834,20 +1814,17 @@
           <w:numId w:val="4"/>
         </w:numPr>
         <w:rPr>
-          <w:lang w:val="en-GB"/>
-        </w:rPr>
-      </w:pPr>
-      <w:r>
-        <w:rPr>
-          <w:lang w:val="en-GB"/>
-        </w:rPr>
-        <w:t xml:space="preserve">OR </w:t>
-      </w:r>
-      <w:r>
-        <w:t>L293D</w:t>
-      </w:r>
-      <w:r>
-        <w:t xml:space="preserve"> (smaller, cheaper).</w:t>
+          <w:i/>
+          <w:iCs/>
+          <w:lang w:val="en-GB"/>
+        </w:rPr>
+      </w:pPr>
+      <w:r>
+        <w:rPr>
+          <w:i/>
+          <w:iCs/>
+        </w:rPr>
+        <w:t>Adafruit themselves recommend the DRV8833 motor driver for these motors, as it works well down to 3V and can handle the maximum current of the motors.</w:t>
       </w:r>
     </w:p>
     <w:p>
@@ -1867,63 +1844,14 @@
             <w:rStyle w:val="Hyperlink"/>
             <w:lang w:val="en-GB"/>
           </w:rPr>
-          <w:t>https://youtu.be/KKoduge9V50?si=kxc7bmY12_8Xtdx-</w:t>
+          <w:t>https://youtu.be/cBS9IGJ8LQc?si=vVlXfKhfLhNzHTyi</w:t>
         </w:r>
       </w:hyperlink>
       <w:r>
         <w:rPr>
           <w:lang w:val="en-GB"/>
         </w:rPr>
-        <w:t xml:space="preserve"> - How to use L293D (1xDC motor per side).</w:t>
-      </w:r>
-    </w:p>
-    <w:p>
-      <w:pPr>
-        <w:jc w:val="center"/>
-        <w:rPr>
-          <w:lang w:val="en-GB"/>
-        </w:rPr>
-      </w:pPr>
-      <w:r>
-        <w:rPr>
-          <w:noProof/>
-          <w:lang w:val="en-GB"/>
-        </w:rPr>
-        <w:drawing>
-          <wp:inline distT="0" distB="0" distL="0" distR="0" wp14:anchorId="40531F17" wp14:editId="4FDC9D95">
-            <wp:extent cx="3912042" cy="2193534"/>
-            <wp:effectExtent l="0" t="0" r="0" b="0"/>
-            <wp:docPr id="1405761707" name="Picture 1"/>
-            <wp:cNvGraphicFramePr>
-              <a:graphicFrameLocks xmlns:a="http://schemas.openxmlformats.org/drawingml/2006/main" noChangeAspect="1"/>
-            </wp:cNvGraphicFramePr>
-            <a:graphic xmlns:a="http://schemas.openxmlformats.org/drawingml/2006/main">
-              <a:graphicData uri="http://schemas.openxmlformats.org/drawingml/2006/picture">
-                <pic:pic xmlns:pic="http://schemas.openxmlformats.org/drawingml/2006/picture">
-                  <pic:nvPicPr>
-                    <pic:cNvPr id="1405761707" name=""/>
-                    <pic:cNvPicPr/>
-                  </pic:nvPicPr>
-                  <pic:blipFill>
-                    <a:blip r:embed="rId21"/>
-                    <a:stretch>
-                      <a:fillRect/>
-                    </a:stretch>
-                  </pic:blipFill>
-                  <pic:spPr>
-                    <a:xfrm>
-                      <a:off x="0" y="0"/>
-                      <a:ext cx="3961817" cy="2221444"/>
-                    </a:xfrm>
-                    <a:prstGeom prst="rect">
-                      <a:avLst/>
-                    </a:prstGeom>
-                  </pic:spPr>
-                </pic:pic>
-              </a:graphicData>
-            </a:graphic>
-          </wp:inline>
-        </w:drawing>
+        <w:t xml:space="preserve"> – DRB8833 tutorial. </w:t>
       </w:r>
     </w:p>
     <w:p>
@@ -1941,7 +1869,37 @@
         <w:rPr>
           <w:lang w:val="en-GB"/>
         </w:rPr>
-        <w:t>Pin explanation:</w:t>
+        <w:t>Motor voltage 2.7 V to 10.8 V, continuous current 1.2 A and peak current 2 A per motor.</w:t>
+      </w:r>
+    </w:p>
+    <w:p>
+      <w:pPr>
+        <w:pStyle w:val="ListParagraph"/>
+        <w:numPr>
+          <w:ilvl w:val="0"/>
+          <w:numId w:val="4"/>
+        </w:numPr>
+        <w:rPr>
+          <w:lang w:val="en-GB"/>
+        </w:rPr>
+      </w:pPr>
+      <w:r>
+        <w:rPr>
+          <w:lang w:val="en-GB"/>
+        </w:rPr>
+        <w:t xml:space="preserve">DRV8833 </w:t>
+      </w:r>
+      <w:r>
+        <w:rPr>
+          <w:lang w:val="en-GB"/>
+        </w:rPr>
+        <w:t>P</w:t>
+      </w:r>
+      <w:r>
+        <w:rPr>
+          <w:lang w:val="en-GB"/>
+        </w:rPr>
+        <w:t>in explanation:</w:t>
       </w:r>
     </w:p>
     <w:tbl>
@@ -2015,7 +1973,7 @@
               <w:rPr>
                 <w:lang w:val="en-GB"/>
               </w:rPr>
-              <w:t>Enable 1,2</w:t>
+              <w:t>EEP</w:t>
             </w:r>
           </w:p>
         </w:tc>
@@ -2025,32 +1983,15 @@
           </w:tcPr>
           <w:p>
             <w:pPr>
-              <w:tabs>
-                <w:tab w:val="left" w:pos="1052"/>
-              </w:tabs>
-              <w:rPr>
-                <w:lang w:val="en-GB"/>
-              </w:rPr>
-            </w:pPr>
-            <w:r>
-              <w:rPr>
-                <w:lang w:val="en-GB"/>
-              </w:rPr>
-              <w:t xml:space="preserve">Controls speed of motor 1 (PWM signal - </w:t>
-            </w:r>
-            <w:proofErr w:type="spellStart"/>
-            <w:r>
-              <w:rPr>
-                <w:lang w:val="en-GB"/>
-              </w:rPr>
-              <w:t>analogueWrite</w:t>
-            </w:r>
-            <w:proofErr w:type="spellEnd"/>
-            <w:r>
-              <w:rPr>
-                <w:lang w:val="en-GB"/>
-              </w:rPr>
-              <w:t>)</w:t>
+              <w:rPr>
+                <w:lang w:val="en-GB"/>
+              </w:rPr>
+            </w:pPr>
+            <w:r>
+              <w:rPr>
+                <w:lang w:val="en-GB"/>
+              </w:rPr>
+              <w:t>Puts device in sleep mode (0V = sleep, 5V = On) (Enabled by default due to J1)</w:t>
             </w:r>
           </w:p>
         </w:tc>
@@ -2070,7 +2011,7 @@
               <w:rPr>
                 <w:lang w:val="en-GB"/>
               </w:rPr>
-              <w:t>Input 1 and Input 2</w:t>
+              <w:t>Output 1 and Output 2</w:t>
             </w:r>
           </w:p>
         </w:tc>
@@ -2088,21 +2029,7 @@
               <w:rPr>
                 <w:lang w:val="en-GB"/>
               </w:rPr>
-              <w:t>Set one high and one low to control motor 1 direction (</w:t>
-            </w:r>
-            <w:proofErr w:type="spellStart"/>
-            <w:r>
-              <w:rPr>
-                <w:lang w:val="en-GB"/>
-              </w:rPr>
-              <w:t>digitalWrite</w:t>
-            </w:r>
-            <w:proofErr w:type="spellEnd"/>
-            <w:r>
-              <w:rPr>
-                <w:lang w:val="en-GB"/>
-              </w:rPr>
-              <w:t>)</w:t>
+              <w:t>Connects to Motor A</w:t>
             </w:r>
           </w:p>
         </w:tc>
@@ -2122,7 +2049,7 @@
               <w:rPr>
                 <w:lang w:val="en-GB"/>
               </w:rPr>
-              <w:t>Output 1 and Output 2</w:t>
+              <w:t>Output 3 and Output 4</w:t>
             </w:r>
           </w:p>
         </w:tc>
@@ -2140,7 +2067,7 @@
               <w:rPr>
                 <w:lang w:val="en-GB"/>
               </w:rPr>
-              <w:t>Connects to motor 1</w:t>
+              <w:t>Connects to Motor B</w:t>
             </w:r>
           </w:p>
         </w:tc>
@@ -2160,8 +2087,7 @@
               <w:rPr>
                 <w:lang w:val="en-GB"/>
               </w:rPr>
-              <w:lastRenderedPageBreak/>
-              <w:t>GND</w:t>
+              <w:t>ULT</w:t>
             </w:r>
           </w:p>
         </w:tc>
@@ -2179,7 +2105,7 @@
               <w:rPr>
                 <w:lang w:val="en-GB"/>
               </w:rPr>
-              <w:t>Ground (must ground to Arduino ground and battery-)</w:t>
+              <w:t>Fault pin (Goes low if error, floats normally)</w:t>
             </w:r>
           </w:p>
         </w:tc>
@@ -2199,7 +2125,7 @@
               <w:rPr>
                 <w:lang w:val="en-GB"/>
               </w:rPr>
-              <w:t>VCC 2</w:t>
+              <w:t>Input 3 and Input 4</w:t>
             </w:r>
           </w:p>
         </w:tc>
@@ -2217,7 +2143,7 @@
               <w:rPr>
                 <w:lang w:val="en-GB"/>
               </w:rPr>
-              <w:t>Connect to positive terminal of battery</w:t>
+              <w:t>Set one high and one low to control Motor B direction</w:t>
             </w:r>
           </w:p>
         </w:tc>
@@ -2237,7 +2163,7 @@
               <w:rPr>
                 <w:lang w:val="en-GB"/>
               </w:rPr>
-              <w:t>VCC 1</w:t>
+              <w:t>GND</w:t>
             </w:r>
           </w:p>
         </w:tc>
@@ -2255,7 +2181,7 @@
               <w:rPr>
                 <w:lang w:val="en-GB"/>
               </w:rPr>
-              <w:t>Powers L293D driver (5V)</w:t>
+              <w:t>Ground (must ground to Arduino ground and battery-)</w:t>
             </w:r>
           </w:p>
         </w:tc>
@@ -2275,7 +2201,7 @@
               <w:rPr>
                 <w:lang w:val="en-GB"/>
               </w:rPr>
-              <w:t>Input 3 and Input 4</w:t>
+              <w:t xml:space="preserve">VCC </w:t>
             </w:r>
           </w:p>
         </w:tc>
@@ -2293,7 +2219,7 @@
               <w:rPr>
                 <w:lang w:val="en-GB"/>
               </w:rPr>
-              <w:t>Set one high and one low to control motor 2 direction</w:t>
+              <w:t>Connect to positive terminal of battery</w:t>
             </w:r>
           </w:p>
         </w:tc>
@@ -2313,7 +2239,8 @@
               <w:rPr>
                 <w:lang w:val="en-GB"/>
               </w:rPr>
-              <w:t>Output 3 and Output 4</w:t>
+              <w:lastRenderedPageBreak/>
+              <w:t>Input 1 and Input 2</w:t>
             </w:r>
           </w:p>
         </w:tc>
@@ -2331,59 +2258,7 @@
               <w:rPr>
                 <w:lang w:val="en-GB"/>
               </w:rPr>
-              <w:t>Connects to motor 2</w:t>
-            </w:r>
-          </w:p>
-        </w:tc>
-      </w:tr>
-      <w:tr>
-        <w:tc>
-          <w:tcPr>
-            <w:tcW w:w="4508" w:type="dxa"/>
-          </w:tcPr>
-          <w:p>
-            <w:pPr>
-              <w:rPr>
-                <w:lang w:val="en-GB"/>
-              </w:rPr>
-            </w:pPr>
-            <w:r>
-              <w:rPr>
-                <w:lang w:val="en-GB"/>
-              </w:rPr>
-              <w:t>Enable 3,4</w:t>
-            </w:r>
-          </w:p>
-        </w:tc>
-        <w:tc>
-          <w:tcPr>
-            <w:tcW w:w="4508" w:type="dxa"/>
-          </w:tcPr>
-          <w:p>
-            <w:pPr>
-              <w:rPr>
-                <w:lang w:val="en-GB"/>
-              </w:rPr>
-            </w:pPr>
-            <w:r>
-              <w:rPr>
-                <w:lang w:val="en-GB"/>
-              </w:rPr>
-              <w:t xml:space="preserve">Controls speed of motor 2 (PWM signal - </w:t>
-            </w:r>
-            <w:proofErr w:type="spellStart"/>
-            <w:r>
-              <w:rPr>
-                <w:lang w:val="en-GB"/>
-              </w:rPr>
-              <w:t>analogueWrite</w:t>
-            </w:r>
-            <w:proofErr w:type="spellEnd"/>
-            <w:r>
-              <w:rPr>
-                <w:lang w:val="en-GB"/>
-              </w:rPr>
-              <w:t>)</w:t>
+              <w:t>Set one high and one low to control Motor A direction (digitalWrite)</w:t>
             </w:r>
           </w:p>
         </w:tc>
@@ -2419,36 +2294,6 @@
           <w:lang w:val="en-GB"/>
         </w:rPr>
         <w:t xml:space="preserve"> (x2)</w:t>
-      </w:r>
-    </w:p>
-    <w:p>
-      <w:pPr>
-        <w:pStyle w:val="ListParagraph"/>
-        <w:numPr>
-          <w:ilvl w:val="0"/>
-          <w:numId w:val="4"/>
-        </w:numPr>
-        <w:rPr>
-          <w:lang w:val="en-GB"/>
-        </w:rPr>
-      </w:pPr>
-      <w:hyperlink r:id="rId22" w:history="1">
-        <w:r>
-          <w:rPr>
-            <w:rStyle w:val="Hyperlink"/>
-            <w:lang w:val="en-GB"/>
-          </w:rPr>
-          <w:t>https://youtu.be/GPVC84D5ULw?si=AKUwRgfWL-u2UtGY</w:t>
-        </w:r>
-      </w:hyperlink>
-      <w:r>
-        <w:t>.</w:t>
-      </w:r>
-      <w:r>
-        <w:rPr>
-          <w:lang w:val="en-GB"/>
-        </w:rPr>
-        <w:t xml:space="preserve"> </w:t>
       </w:r>
     </w:p>
     <w:p>
@@ -2475,13 +2320,21 @@
         <w:rPr>
           <w:lang w:val="en-GB"/>
         </w:rPr>
-        <w:t xml:space="preserve"> – Tips video uses standard yellow motors (see below) with L293D motor drivers.</w:t>
-      </w:r>
-      <w:r>
-        <w:rPr>
-          <w:lang w:val="en-GB"/>
-        </w:rPr>
-        <w:tab/>
+        <w:t xml:space="preserve"> </w:t>
+      </w:r>
+      <w:r>
+        <w:rPr>
+          <w:i/>
+          <w:iCs/>
+          <w:lang w:val="en-GB"/>
+        </w:rPr>
+        <w:t>Standard ones from Micromouse project</w:t>
+      </w:r>
+      <w:r>
+        <w:rPr>
+          <w:lang w:val="en-GB"/>
+        </w:rPr>
+        <w:t>.</w:t>
       </w:r>
     </w:p>
     <w:p>
@@ -2500,10 +2353,10 @@
           <w:lang w:val="en-GB"/>
         </w:rPr>
         <w:drawing>
-          <wp:inline distT="0" distB="0" distL="0" distR="0" wp14:anchorId="5D962A01" wp14:editId="64D65023">
+          <wp:inline distT="0" distB="0" distL="0" distR="0" wp14:anchorId="089FA19F" wp14:editId="6F0813D2">
             <wp:extent cx="3751635" cy="2019631"/>
             <wp:effectExtent l="0" t="0" r="1270" b="0"/>
-            <wp:docPr id="1821756873" name="Picture 1"/>
+            <wp:docPr id="990260299" name="Picture 1"/>
             <wp:cNvGraphicFramePr>
               <a:graphicFrameLocks xmlns:a="http://schemas.openxmlformats.org/drawingml/2006/main" noChangeAspect="1"/>
             </wp:cNvGraphicFramePr>
@@ -2515,7 +2368,7 @@
                     <pic:cNvPicPr/>
                   </pic:nvPicPr>
                   <pic:blipFill>
-                    <a:blip r:embed="rId23"/>
+                    <a:blip r:embed="rId21"/>
                     <a:stretch>
                       <a:fillRect/>
                     </a:stretch>
@@ -2574,27 +2427,7 @@
         <w:rPr>
           <w:lang w:val="en-GB"/>
         </w:rPr>
-        <w:t xml:space="preserve">Standard wheels we used for </w:t>
-      </w:r>
-      <w:proofErr w:type="spellStart"/>
-      <w:r>
-        <w:rPr>
-          <w:lang w:val="en-GB"/>
-        </w:rPr>
-        <w:t>M</w:t>
-      </w:r>
-      <w:r>
-        <w:rPr>
-          <w:lang w:val="en-GB"/>
-        </w:rPr>
-        <w:t>icromouse</w:t>
-      </w:r>
-      <w:proofErr w:type="spellEnd"/>
-      <w:r>
-        <w:rPr>
-          <w:lang w:val="en-GB"/>
-        </w:rPr>
-        <w:t xml:space="preserve"> (see below).</w:t>
+        <w:t>Standard wheels we used for micromouse (see below).</w:t>
       </w:r>
     </w:p>
     <w:p>
@@ -2613,10 +2446,10 @@
           <w:lang w:val="en-GB"/>
         </w:rPr>
         <w:drawing>
-          <wp:inline distT="0" distB="0" distL="0" distR="0" wp14:anchorId="0CCD3E83" wp14:editId="38E3DB5E">
+          <wp:inline distT="0" distB="0" distL="0" distR="0" wp14:anchorId="23ED4EEF" wp14:editId="61F9F32D">
             <wp:extent cx="4385009" cy="2297927"/>
             <wp:effectExtent l="0" t="0" r="0" b="7620"/>
-            <wp:docPr id="1496715387" name="Picture 1"/>
+            <wp:docPr id="1729910162" name="Picture 1"/>
             <wp:cNvGraphicFramePr>
               <a:graphicFrameLocks xmlns:a="http://schemas.openxmlformats.org/drawingml/2006/main" noChangeAspect="1"/>
             </wp:cNvGraphicFramePr>
@@ -2628,7 +2461,7 @@
                     <pic:cNvPicPr/>
                   </pic:nvPicPr>
                   <pic:blipFill>
-                    <a:blip r:embed="rId24"/>
+                    <a:blip r:embed="rId22"/>
                     <a:stretch>
                       <a:fillRect/>
                     </a:stretch>
@@ -2651,26 +2484,6 @@
     </w:p>
     <w:p>
       <w:pPr>
-        <w:tabs>
-          <w:tab w:val="left" w:pos="2680"/>
-        </w:tabs>
-        <w:rPr>
-          <w:b/>
-          <w:bCs/>
-          <w:lang w:val="en-GB"/>
-        </w:rPr>
-      </w:pPr>
-      <w:r>
-        <w:rPr>
-          <w:b/>
-          <w:bCs/>
-          <w:lang w:val="en-GB"/>
-        </w:rPr>
-        <w:t>Chassis</w:t>
-      </w:r>
-    </w:p>
-    <w:p>
-      <w:pPr>
         <w:pStyle w:val="ListParagraph"/>
         <w:numPr>
           <w:ilvl w:val="0"/>
@@ -2687,7 +2500,27 @@
         <w:rPr>
           <w:lang w:val="en-GB"/>
         </w:rPr>
-        <w:t>3D print?</w:t>
+        <w:t xml:space="preserve">If struggling with control, larger wheels (diameter) can improve stability. </w:t>
+      </w:r>
+    </w:p>
+    <w:p>
+      <w:pPr>
+        <w:tabs>
+          <w:tab w:val="left" w:pos="2680"/>
+        </w:tabs>
+        <w:rPr>
+          <w:b/>
+          <w:bCs/>
+          <w:lang w:val="en-GB"/>
+        </w:rPr>
+      </w:pPr>
+      <w:r>
+        <w:rPr>
+          <w:b/>
+          <w:bCs/>
+          <w:lang w:val="en-GB"/>
+        </w:rPr>
+        <w:t>Chassis</w:t>
       </w:r>
     </w:p>
     <w:p>
@@ -2704,12 +2537,40 @@
           <w:lang w:val="en-GB"/>
         </w:rPr>
       </w:pPr>
-      <w:r>
-        <w:rPr>
-          <w:lang w:val="en-GB"/>
-        </w:rPr>
-        <w:lastRenderedPageBreak/>
-        <w:t>Use breadboard?</w:t>
+      <w:hyperlink r:id="rId23" w:history="1">
+        <w:r>
+          <w:rPr>
+            <w:rStyle w:val="Hyperlink"/>
+            <w:lang w:val="en-GB"/>
+          </w:rPr>
+          <w:t>https://www.communica.co.za/collections/enclosures/products/abs20-black</w:t>
+        </w:r>
+      </w:hyperlink>
+      <w:r>
+        <w:rPr>
+          <w:lang w:val="en-GB"/>
+        </w:rPr>
+        <w:t xml:space="preserve"> </w:t>
+      </w:r>
+    </w:p>
+    <w:p>
+      <w:pPr>
+        <w:tabs>
+          <w:tab w:val="left" w:pos="2680"/>
+        </w:tabs>
+        <w:rPr>
+          <w:b/>
+          <w:bCs/>
+          <w:lang w:val="en-GB"/>
+        </w:rPr>
+      </w:pPr>
+      <w:r>
+        <w:rPr>
+          <w:b/>
+          <w:bCs/>
+          <w:lang w:val="en-GB"/>
+        </w:rPr>
+        <w:t>Battery</w:t>
       </w:r>
     </w:p>
     <w:p>
@@ -2730,27 +2591,19 @@
         <w:rPr>
           <w:lang w:val="en-GB"/>
         </w:rPr>
-        <w:t>Will try and use breadboard and Arduino together directly connected to motors. Possibly both need to be put on small wooden board.</w:t>
-      </w:r>
-    </w:p>
-    <w:p>
-      <w:pPr>
-        <w:tabs>
-          <w:tab w:val="left" w:pos="2680"/>
-        </w:tabs>
-        <w:rPr>
-          <w:b/>
-          <w:bCs/>
-          <w:lang w:val="en-GB"/>
-        </w:rPr>
-      </w:pPr>
-      <w:r>
-        <w:rPr>
-          <w:b/>
-          <w:bCs/>
-          <w:lang w:val="en-GB"/>
-        </w:rPr>
-        <w:t>Battery</w:t>
+        <w:t>C</w:t>
+      </w:r>
+      <w:r>
+        <w:rPr>
+          <w:lang w:val="en-GB"/>
+        </w:rPr>
+        <w:t>an power from laptop to start</w:t>
+      </w:r>
+      <w:r>
+        <w:rPr>
+          <w:lang w:val="en-GB"/>
+        </w:rPr>
+        <w:t xml:space="preserve"> (only motors will need batteries).</w:t>
       </w:r>
     </w:p>
     <w:p>
@@ -2767,17 +2620,20 @@
           <w:lang w:val="en-GB"/>
         </w:rPr>
       </w:pPr>
-      <w:r>
-        <w:rPr>
-          <w:lang w:val="en-GB"/>
-        </w:rPr>
-        <w:t>C</w:t>
-      </w:r>
-      <w:r>
-        <w:rPr>
-          <w:lang w:val="en-GB"/>
-        </w:rPr>
-        <w:t>an power from laptop to start?</w:t>
+      <w:hyperlink r:id="rId24" w:history="1">
+        <w:r>
+          <w:rPr>
+            <w:rStyle w:val="Hyperlink"/>
+            <w:lang w:val="en-GB"/>
+          </w:rPr>
+          <w:t>https://www.robotics.org.za/603450</w:t>
+        </w:r>
+      </w:hyperlink>
+      <w:r>
+        <w:rPr>
+          <w:lang w:val="en-GB"/>
+        </w:rPr>
+        <w:t xml:space="preserve"> - 7.4V battery.</w:t>
       </w:r>
     </w:p>
     <w:p>
@@ -2794,34 +2650,11 @@
           <w:lang w:val="en-GB"/>
         </w:rPr>
       </w:pPr>
-      <w:hyperlink r:id="rId25" w:history="1">
-        <w:r>
-          <w:rPr>
-            <w:rStyle w:val="Hyperlink"/>
-            <w:lang w:val="en-GB"/>
-          </w:rPr>
-          <w:t>https://www.robotics.org.za/503759</w:t>
-        </w:r>
-      </w:hyperlink>
-      <w:r>
-        <w:rPr>
-          <w:lang w:val="en-GB"/>
-        </w:rPr>
-        <w:t xml:space="preserve"> - </w:t>
-      </w:r>
-      <w:r>
-        <w:rPr>
-          <w:i/>
-          <w:iCs/>
-          <w:lang w:val="en-GB"/>
-        </w:rPr>
-        <w:t>Too low voltage</w:t>
-      </w:r>
-      <w:r>
-        <w:rPr>
-          <w:lang w:val="en-GB"/>
-        </w:rPr>
-        <w:t>.</w:t>
+      <w:r>
+        <w:rPr>
+          <w:lang w:val="en-GB"/>
+        </w:rPr>
+        <w:t>Will need a charging circuit too.</w:t>
       </w:r>
     </w:p>
     <w:p>
@@ -2838,11 +2671,20 @@
           <w:lang w:val="en-GB"/>
         </w:rPr>
       </w:pPr>
-      <w:r>
-        <w:rPr>
-          <w:lang w:val="en-GB"/>
-        </w:rPr>
-        <w:t xml:space="preserve">Look at micro mouse project for battery charging circuit with switch (maybe I don’t need a switch). </w:t>
+      <w:hyperlink r:id="rId25" w:history="1">
+        <w:r>
+          <w:rPr>
+            <w:rStyle w:val="Hyperlink"/>
+            <w:lang w:val="en-GB"/>
+          </w:rPr>
+          <w:t>https://www.robotics.org.za/DFR0564</w:t>
+        </w:r>
+      </w:hyperlink>
+      <w:r>
+        <w:rPr>
+          <w:lang w:val="en-GB"/>
+        </w:rPr>
+        <w:t xml:space="preserve"> - Battery charger circuit (USB).</w:t>
       </w:r>
     </w:p>
     <w:p>
@@ -2859,91 +2701,11 @@
           <w:lang w:val="en-GB"/>
         </w:rPr>
       </w:pPr>
-      <w:hyperlink r:id="rId26" w:history="1">
-        <w:r>
-          <w:rPr>
-            <w:rStyle w:val="Hyperlink"/>
-            <w:lang w:val="en-GB"/>
-          </w:rPr>
-          <w:t>https://www.robotics.org.za/603450</w:t>
-        </w:r>
-      </w:hyperlink>
-      <w:r>
-        <w:rPr>
-          <w:lang w:val="en-GB"/>
-        </w:rPr>
-        <w:t xml:space="preserve"> - 7.4V battery.</w:t>
-      </w:r>
-    </w:p>
-    <w:p>
-      <w:pPr>
-        <w:pStyle w:val="ListParagraph"/>
-        <w:numPr>
-          <w:ilvl w:val="0"/>
-          <w:numId w:val="4"/>
-        </w:numPr>
-        <w:tabs>
-          <w:tab w:val="left" w:pos="2680"/>
-        </w:tabs>
-        <w:rPr>
-          <w:lang w:val="en-GB"/>
-        </w:rPr>
-      </w:pPr>
-      <w:r>
-        <w:rPr>
-          <w:lang w:val="en-GB"/>
-        </w:rPr>
-        <w:t>Will need a charging circuit too.</w:t>
-      </w:r>
-    </w:p>
-    <w:p>
-      <w:pPr>
-        <w:pStyle w:val="ListParagraph"/>
-        <w:numPr>
-          <w:ilvl w:val="0"/>
-          <w:numId w:val="4"/>
-        </w:numPr>
-        <w:tabs>
-          <w:tab w:val="left" w:pos="2680"/>
-        </w:tabs>
-        <w:rPr>
-          <w:lang w:val="en-GB"/>
-        </w:rPr>
-      </w:pPr>
-      <w:hyperlink r:id="rId27" w:history="1">
-        <w:r>
-          <w:rPr>
-            <w:rStyle w:val="Hyperlink"/>
-            <w:lang w:val="en-GB"/>
-          </w:rPr>
-          <w:t>https://www.robotics.org.za/DFR0564</w:t>
-        </w:r>
-      </w:hyperlink>
-      <w:r>
-        <w:rPr>
-          <w:lang w:val="en-GB"/>
-        </w:rPr>
-        <w:t xml:space="preserve"> - Battery charger circuit (USB).</w:t>
-      </w:r>
-    </w:p>
-    <w:p>
-      <w:pPr>
-        <w:pStyle w:val="ListParagraph"/>
-        <w:numPr>
-          <w:ilvl w:val="0"/>
-          <w:numId w:val="4"/>
-        </w:numPr>
-        <w:tabs>
-          <w:tab w:val="left" w:pos="2680"/>
-        </w:tabs>
-        <w:rPr>
-          <w:lang w:val="en-GB"/>
-        </w:rPr>
-      </w:pPr>
-      <w:r>
-        <w:rPr>
-          <w:lang w:val="en-GB"/>
-        </w:rPr>
+      <w:r>
+        <w:rPr>
+          <w:lang w:val="en-GB"/>
+        </w:rPr>
+        <w:lastRenderedPageBreak/>
         <w:t xml:space="preserve">Do I need JST PH connector to connect to breadboard (something like below)? </w:t>
       </w:r>
       <w:r>
@@ -2979,10 +2741,10 @@
           <w:lang w:val="en-GB"/>
         </w:rPr>
         <w:drawing>
-          <wp:inline distT="0" distB="0" distL="0" distR="0" wp14:anchorId="18636C55" wp14:editId="393FC1C9">
+          <wp:inline distT="0" distB="0" distL="0" distR="0" wp14:anchorId="4CF2E2B5" wp14:editId="1CF02009">
             <wp:extent cx="3133263" cy="1932167"/>
             <wp:effectExtent l="0" t="0" r="0" b="0"/>
-            <wp:docPr id="1085557133" name="Picture 1"/>
+            <wp:docPr id="1098650640" name="Picture 1"/>
             <wp:cNvGraphicFramePr>
               <a:graphicFrameLocks xmlns:a="http://schemas.openxmlformats.org/drawingml/2006/main" noChangeAspect="1"/>
             </wp:cNvGraphicFramePr>
@@ -2994,7 +2756,7 @@
                     <pic:cNvPicPr/>
                   </pic:nvPicPr>
                   <pic:blipFill>
-                    <a:blip r:embed="rId28"/>
+                    <a:blip r:embed="rId26"/>
                     <a:stretch>
                       <a:fillRect/>
                     </a:stretch>
@@ -3029,7 +2791,7 @@
           <w:lang w:val="en-GB"/>
         </w:rPr>
       </w:pPr>
-      <w:hyperlink r:id="rId29" w:history="1">
+      <w:hyperlink r:id="rId27" w:history="1">
         <w:r>
           <w:rPr>
             <w:rStyle w:val="Hyperlink"/>
@@ -3042,21 +2804,7 @@
         <w:rPr>
           <w:lang w:val="en-GB"/>
         </w:rPr>
-        <w:t xml:space="preserve"> - </w:t>
-      </w:r>
-      <w:proofErr w:type="spellStart"/>
-      <w:r>
-        <w:rPr>
-          <w:lang w:val="en-GB"/>
-        </w:rPr>
-        <w:t>Communica</w:t>
-      </w:r>
-      <w:proofErr w:type="spellEnd"/>
-      <w:r>
-        <w:rPr>
-          <w:lang w:val="en-GB"/>
-        </w:rPr>
-        <w:t xml:space="preserve"> version.</w:t>
+        <w:t xml:space="preserve"> - Communica version.</w:t>
       </w:r>
     </w:p>
     <w:p>
@@ -3076,7 +2824,7 @@
           <w:bCs/>
           <w:lang w:val="en-GB"/>
         </w:rPr>
-        <w:t>Other</w:t>
+        <w:t>Potentiometers</w:t>
       </w:r>
     </w:p>
     <w:p>
@@ -3093,11 +2841,20 @@
           <w:lang w:val="en-GB"/>
         </w:rPr>
       </w:pPr>
-      <w:r>
-        <w:rPr>
-          <w:lang w:val="en-GB"/>
-        </w:rPr>
-        <w:t>Nice small breadboard with multiple dividers? See below link.</w:t>
+      <w:hyperlink r:id="rId28" w:history="1">
+        <w:r>
+          <w:rPr>
+            <w:rStyle w:val="Hyperlink"/>
+            <w:lang w:val="en-GB"/>
+          </w:rPr>
+          <w:t>https://www.robotics.org.za/index.php?route=product/category&amp;path=25_327</w:t>
+        </w:r>
+      </w:hyperlink>
+      <w:r>
+        <w:rPr>
+          <w:lang w:val="en-GB"/>
+        </w:rPr>
+        <w:t xml:space="preserve"> – general page.</w:t>
       </w:r>
     </w:p>
     <w:p>
@@ -3114,7 +2871,191 @@
           <w:lang w:val="en-GB"/>
         </w:rPr>
       </w:pPr>
+      <w:hyperlink r:id="rId29" w:history="1">
+        <w:r>
+          <w:rPr>
+            <w:rStyle w:val="Hyperlink"/>
+            <w:lang w:val="en-GB"/>
+          </w:rPr>
+          <w:t>https://www.robotics.org.za/WH148-10K</w:t>
+        </w:r>
+      </w:hyperlink>
+      <w:r>
+        <w:rPr>
+          <w:lang w:val="en-GB"/>
+        </w:rPr>
+        <w:t xml:space="preserve"> - cheaper option and pack of four.</w:t>
+      </w:r>
+    </w:p>
+    <w:p>
+      <w:pPr>
+        <w:tabs>
+          <w:tab w:val="left" w:pos="2680"/>
+        </w:tabs>
+        <w:rPr>
+          <w:b/>
+          <w:bCs/>
+          <w:lang w:val="en-GB"/>
+        </w:rPr>
+      </w:pPr>
+      <w:r>
+        <w:rPr>
+          <w:b/>
+          <w:bCs/>
+          <w:lang w:val="en-GB"/>
+        </w:rPr>
+        <w:t>Switch</w:t>
+      </w:r>
+    </w:p>
+    <w:p>
+      <w:pPr>
+        <w:pStyle w:val="ListParagraph"/>
+        <w:numPr>
+          <w:ilvl w:val="0"/>
+          <w:numId w:val="4"/>
+        </w:numPr>
+        <w:tabs>
+          <w:tab w:val="left" w:pos="2680"/>
+        </w:tabs>
+        <w:rPr>
+          <w:lang w:val="en-GB"/>
+        </w:rPr>
+      </w:pPr>
+      <w:r>
+        <w:rPr>
+          <w:lang w:val="en-GB"/>
+        </w:rPr>
+        <w:t>Needs to be 12 V, 1 A rated.</w:t>
+      </w:r>
+    </w:p>
+    <w:p>
+      <w:pPr>
+        <w:pStyle w:val="ListParagraph"/>
+        <w:numPr>
+          <w:ilvl w:val="0"/>
+          <w:numId w:val="4"/>
+        </w:numPr>
+        <w:tabs>
+          <w:tab w:val="left" w:pos="2680"/>
+        </w:tabs>
+        <w:rPr>
+          <w:lang w:val="en-GB"/>
+        </w:rPr>
+      </w:pPr>
+      <w:r>
+        <w:rPr>
+          <w:lang w:val="en-GB"/>
+        </w:rPr>
+        <w:t>Must be DC.</w:t>
+      </w:r>
+    </w:p>
+    <w:p>
+      <w:pPr>
+        <w:pStyle w:val="ListParagraph"/>
+        <w:numPr>
+          <w:ilvl w:val="0"/>
+          <w:numId w:val="4"/>
+        </w:numPr>
+        <w:tabs>
+          <w:tab w:val="left" w:pos="2680"/>
+        </w:tabs>
+        <w:rPr>
+          <w:lang w:val="en-GB"/>
+        </w:rPr>
+      </w:pPr>
+      <w:r>
+        <w:rPr>
+          <w:lang w:val="en-GB"/>
+        </w:rPr>
+        <w:t>Ideally fits in a breadboard.</w:t>
+      </w:r>
+    </w:p>
+    <w:p>
+      <w:pPr>
+        <w:pStyle w:val="ListParagraph"/>
+        <w:numPr>
+          <w:ilvl w:val="0"/>
+          <w:numId w:val="4"/>
+        </w:numPr>
+        <w:tabs>
+          <w:tab w:val="left" w:pos="2680"/>
+        </w:tabs>
+        <w:rPr>
+          <w:lang w:val="en-GB"/>
+        </w:rPr>
+      </w:pPr>
       <w:hyperlink r:id="rId30" w:history="1">
+        <w:r>
+          <w:rPr>
+            <w:rStyle w:val="Hyperlink"/>
+            <w:lang w:val="en-GB"/>
+          </w:rPr>
+          <w:t>https://www.robotics.org.za/KBT001129-BLU</w:t>
+        </w:r>
+      </w:hyperlink>
+      <w:r>
+        <w:rPr>
+          <w:lang w:val="en-GB"/>
+        </w:rPr>
+        <w:t xml:space="preserve"> </w:t>
+      </w:r>
+    </w:p>
+    <w:p>
+      <w:pPr>
+        <w:tabs>
+          <w:tab w:val="left" w:pos="2680"/>
+        </w:tabs>
+        <w:rPr>
+          <w:b/>
+          <w:bCs/>
+          <w:lang w:val="en-GB"/>
+        </w:rPr>
+      </w:pPr>
+      <w:r>
+        <w:rPr>
+          <w:b/>
+          <w:bCs/>
+          <w:lang w:val="en-GB"/>
+        </w:rPr>
+        <w:t>Other</w:t>
+      </w:r>
+    </w:p>
+    <w:p>
+      <w:pPr>
+        <w:pStyle w:val="ListParagraph"/>
+        <w:numPr>
+          <w:ilvl w:val="0"/>
+          <w:numId w:val="4"/>
+        </w:numPr>
+        <w:tabs>
+          <w:tab w:val="left" w:pos="2680"/>
+        </w:tabs>
+        <w:rPr>
+          <w:lang w:val="en-GB"/>
+        </w:rPr>
+      </w:pPr>
+      <w:r>
+        <w:rPr>
+          <w:lang w:val="en-GB"/>
+        </w:rPr>
+        <w:t>Nice small breadboard with multiple dividers? See below link.</w:t>
+      </w:r>
+    </w:p>
+    <w:p>
+      <w:pPr>
+        <w:pStyle w:val="ListParagraph"/>
+        <w:numPr>
+          <w:ilvl w:val="0"/>
+          <w:numId w:val="4"/>
+        </w:numPr>
+        <w:tabs>
+          <w:tab w:val="left" w:pos="2680"/>
+        </w:tabs>
+        <w:rPr>
+          <w:lang w:val="en-GB"/>
+        </w:rPr>
+      </w:pPr>
+      <w:hyperlink r:id="rId31" w:history="1">
         <w:r>
           <w:rPr>
             <w:rStyle w:val="Hyperlink"/>
@@ -3323,7 +3264,6 @@
               <w:rPr>
                 <w:lang w:val="en-GB"/>
               </w:rPr>
-              <w:lastRenderedPageBreak/>
               <w:t>VCC</w:t>
             </w:r>
           </w:p>
@@ -3412,6 +3352,7 @@
               <w:rPr>
                 <w:lang w:val="en-GB"/>
               </w:rPr>
+              <w:lastRenderedPageBreak/>
               <w:t>SCL</w:t>
             </w:r>
           </w:p>
@@ -3504,8 +3445,9 @@
               <w:rPr>
                 <w:b/>
                 <w:bCs/>
-              </w:rPr>
-              <w:t>L293D</w:t>
+                <w:lang w:val="en-GB"/>
+              </w:rPr>
+              <w:t>DRV8833</w:t>
             </w:r>
           </w:p>
         </w:tc>
@@ -3528,7 +3470,7 @@
               <w:rPr>
                 <w:lang w:val="en-GB"/>
               </w:rPr>
-              <w:t>Enable 1,2</w:t>
+              <w:t>EEP</w:t>
             </w:r>
           </w:p>
         </w:tc>
@@ -3549,7 +3491,7 @@
               <w:rPr>
                 <w:lang w:val="en-GB"/>
               </w:rPr>
-              <w:t>Digital Pin 5 Arduino</w:t>
+              <w:t>---</w:t>
             </w:r>
           </w:p>
         </w:tc>
@@ -3572,7 +3514,7 @@
               <w:rPr>
                 <w:lang w:val="en-GB"/>
               </w:rPr>
-              <w:t>Input 1</w:t>
+              <w:t>Out 1</w:t>
             </w:r>
           </w:p>
         </w:tc>
@@ -3593,7 +3535,7 @@
               <w:rPr>
                 <w:lang w:val="en-GB"/>
               </w:rPr>
-              <w:t>Digital Pin 2 Arduino</w:t>
+              <w:t>Motor A</w:t>
             </w:r>
           </w:p>
         </w:tc>
@@ -3616,7 +3558,7 @@
               <w:rPr>
                 <w:lang w:val="en-GB"/>
               </w:rPr>
-              <w:t>Output 1</w:t>
+              <w:t>Out 2</w:t>
             </w:r>
           </w:p>
         </w:tc>
@@ -3637,7 +3579,7 @@
               <w:rPr>
                 <w:lang w:val="en-GB"/>
               </w:rPr>
-              <w:t>Motor1+</w:t>
+              <w:t>Motor A</w:t>
             </w:r>
           </w:p>
         </w:tc>
@@ -3660,7 +3602,7 @@
               <w:rPr>
                 <w:lang w:val="en-GB"/>
               </w:rPr>
-              <w:t>GND</w:t>
+              <w:t>Out 3</w:t>
             </w:r>
           </w:p>
         </w:tc>
@@ -3681,7 +3623,7 @@
               <w:rPr>
                 <w:lang w:val="en-GB"/>
               </w:rPr>
-              <w:t>---</w:t>
+              <w:t>Motor B</w:t>
             </w:r>
           </w:p>
         </w:tc>
@@ -3704,7 +3646,7 @@
               <w:rPr>
                 <w:lang w:val="en-GB"/>
               </w:rPr>
-              <w:t>GND</w:t>
+              <w:t>Out 4</w:t>
             </w:r>
           </w:p>
         </w:tc>
@@ -3725,7 +3667,7 @@
               <w:rPr>
                 <w:lang w:val="en-GB"/>
               </w:rPr>
-              <w:t>---</w:t>
+              <w:t>Motor B</w:t>
             </w:r>
           </w:p>
         </w:tc>
@@ -3748,7 +3690,7 @@
               <w:rPr>
                 <w:lang w:val="en-GB"/>
               </w:rPr>
-              <w:t>Output 2</w:t>
+              <w:t>ULT</w:t>
             </w:r>
           </w:p>
         </w:tc>
@@ -3769,7 +3711,7 @@
               <w:rPr>
                 <w:lang w:val="en-GB"/>
               </w:rPr>
-              <w:t>Motor1-</w:t>
+              <w:t>---</w:t>
             </w:r>
           </w:p>
         </w:tc>
@@ -3792,7 +3734,7 @@
               <w:rPr>
                 <w:lang w:val="en-GB"/>
               </w:rPr>
-              <w:t>Input 2</w:t>
+              <w:t>IN 4</w:t>
             </w:r>
           </w:p>
         </w:tc>
@@ -3813,7 +3755,7 @@
               <w:rPr>
                 <w:lang w:val="en-GB"/>
               </w:rPr>
-              <w:t>Digital Pin 3 Arduino</w:t>
+              <w:t>Arduino Digital Output Pin</w:t>
             </w:r>
           </w:p>
         </w:tc>
@@ -3836,7 +3778,7 @@
               <w:rPr>
                 <w:lang w:val="en-GB"/>
               </w:rPr>
-              <w:t>VCC 2</w:t>
+              <w:t>IN 3</w:t>
             </w:r>
           </w:p>
         </w:tc>
@@ -3857,7 +3799,7 @@
               <w:rPr>
                 <w:lang w:val="en-GB"/>
               </w:rPr>
-              <w:t>Battery+</w:t>
+              <w:t>Arduino Digital Output Pin</w:t>
             </w:r>
           </w:p>
         </w:tc>
@@ -3880,7 +3822,7 @@
               <w:rPr>
                 <w:lang w:val="en-GB"/>
               </w:rPr>
-              <w:t>VCC 1</w:t>
+              <w:t>GND</w:t>
             </w:r>
           </w:p>
         </w:tc>
@@ -3901,7 +3843,7 @@
               <w:rPr>
                 <w:lang w:val="en-GB"/>
               </w:rPr>
-              <w:t>5V Pin Arduino</w:t>
+              <w:t>Battery- and Arduino GND</w:t>
             </w:r>
           </w:p>
         </w:tc>
@@ -3924,7 +3866,7 @@
               <w:rPr>
                 <w:lang w:val="en-GB"/>
               </w:rPr>
-              <w:t>Input 4</w:t>
+              <w:t>VCC</w:t>
             </w:r>
           </w:p>
         </w:tc>
@@ -3945,7 +3887,7 @@
               <w:rPr>
                 <w:lang w:val="en-GB"/>
               </w:rPr>
-              <w:t>Digital Pin Arduino</w:t>
+              <w:t>Battery+</w:t>
             </w:r>
           </w:p>
         </w:tc>
@@ -3968,7 +3910,7 @@
               <w:rPr>
                 <w:lang w:val="en-GB"/>
               </w:rPr>
-              <w:t>Output 4</w:t>
+              <w:t>IN2</w:t>
             </w:r>
           </w:p>
         </w:tc>
@@ -3989,7 +3931,7 @@
               <w:rPr>
                 <w:lang w:val="en-GB"/>
               </w:rPr>
-              <w:t>Motor2+</w:t>
+              <w:t>Arduino Digital Output Pin</w:t>
             </w:r>
           </w:p>
         </w:tc>
@@ -4012,7 +3954,7 @@
               <w:rPr>
                 <w:lang w:val="en-GB"/>
               </w:rPr>
-              <w:t>GND</w:t>
+              <w:t>IN1</w:t>
             </w:r>
           </w:p>
         </w:tc>
@@ -4033,183 +3975,7 @@
               <w:rPr>
                 <w:lang w:val="en-GB"/>
               </w:rPr>
-              <w:t>GND Arduino</w:t>
-            </w:r>
-          </w:p>
-        </w:tc>
-      </w:tr>
-      <w:tr>
-        <w:tc>
-          <w:tcPr>
-            <w:tcW w:w="4508" w:type="dxa"/>
-          </w:tcPr>
-          <w:p>
-            <w:pPr>
-              <w:tabs>
-                <w:tab w:val="left" w:pos="2680"/>
-              </w:tabs>
-              <w:rPr>
-                <w:lang w:val="en-GB"/>
-              </w:rPr>
-            </w:pPr>
-            <w:r>
-              <w:rPr>
-                <w:lang w:val="en-GB"/>
-              </w:rPr>
-              <w:t>GND</w:t>
-            </w:r>
-          </w:p>
-        </w:tc>
-        <w:tc>
-          <w:tcPr>
-            <w:tcW w:w="4508" w:type="dxa"/>
-          </w:tcPr>
-          <w:p>
-            <w:pPr>
-              <w:tabs>
-                <w:tab w:val="left" w:pos="2680"/>
-              </w:tabs>
-              <w:rPr>
-                <w:lang w:val="en-GB"/>
-              </w:rPr>
-            </w:pPr>
-            <w:r>
-              <w:rPr>
-                <w:lang w:val="en-GB"/>
-              </w:rPr>
-              <w:t>Battery-</w:t>
-            </w:r>
-          </w:p>
-        </w:tc>
-      </w:tr>
-      <w:tr>
-        <w:tc>
-          <w:tcPr>
-            <w:tcW w:w="4508" w:type="dxa"/>
-          </w:tcPr>
-          <w:p>
-            <w:pPr>
-              <w:tabs>
-                <w:tab w:val="left" w:pos="2680"/>
-              </w:tabs>
-              <w:rPr>
-                <w:lang w:val="en-GB"/>
-              </w:rPr>
-            </w:pPr>
-            <w:r>
-              <w:rPr>
-                <w:lang w:val="en-GB"/>
-              </w:rPr>
-              <w:t>Output 3</w:t>
-            </w:r>
-          </w:p>
-        </w:tc>
-        <w:tc>
-          <w:tcPr>
-            <w:tcW w:w="4508" w:type="dxa"/>
-          </w:tcPr>
-          <w:p>
-            <w:pPr>
-              <w:tabs>
-                <w:tab w:val="left" w:pos="2680"/>
-              </w:tabs>
-              <w:rPr>
-                <w:lang w:val="en-GB"/>
-              </w:rPr>
-            </w:pPr>
-            <w:r>
-              <w:rPr>
-                <w:lang w:val="en-GB"/>
-              </w:rPr>
-              <w:t>Motor2-</w:t>
-            </w:r>
-          </w:p>
-        </w:tc>
-      </w:tr>
-      <w:tr>
-        <w:tc>
-          <w:tcPr>
-            <w:tcW w:w="4508" w:type="dxa"/>
-          </w:tcPr>
-          <w:p>
-            <w:pPr>
-              <w:tabs>
-                <w:tab w:val="left" w:pos="2680"/>
-              </w:tabs>
-              <w:rPr>
-                <w:lang w:val="en-GB"/>
-              </w:rPr>
-            </w:pPr>
-            <w:r>
-              <w:rPr>
-                <w:lang w:val="en-GB"/>
-              </w:rPr>
-              <w:t>Input 3</w:t>
-            </w:r>
-          </w:p>
-        </w:tc>
-        <w:tc>
-          <w:tcPr>
-            <w:tcW w:w="4508" w:type="dxa"/>
-          </w:tcPr>
-          <w:p>
-            <w:pPr>
-              <w:tabs>
-                <w:tab w:val="left" w:pos="2680"/>
-              </w:tabs>
-              <w:rPr>
-                <w:lang w:val="en-GB"/>
-              </w:rPr>
-            </w:pPr>
-            <w:r>
-              <w:rPr>
-                <w:lang w:val="en-GB"/>
-              </w:rPr>
-              <w:t>Digital Pin Arduino</w:t>
-            </w:r>
-          </w:p>
-        </w:tc>
-      </w:tr>
-      <w:tr>
-        <w:tc>
-          <w:tcPr>
-            <w:tcW w:w="4508" w:type="dxa"/>
-          </w:tcPr>
-          <w:p>
-            <w:pPr>
-              <w:tabs>
-                <w:tab w:val="left" w:pos="2680"/>
-              </w:tabs>
-              <w:rPr>
-                <w:lang w:val="en-GB"/>
-              </w:rPr>
-            </w:pPr>
-            <w:r>
-              <w:rPr>
-                <w:lang w:val="en-GB"/>
-              </w:rPr>
-              <w:t>Enable 3,4</w:t>
-            </w:r>
-          </w:p>
-        </w:tc>
-        <w:tc>
-          <w:tcPr>
-            <w:tcW w:w="4508" w:type="dxa"/>
-          </w:tcPr>
-          <w:p>
-            <w:pPr>
-              <w:tabs>
-                <w:tab w:val="left" w:pos="2680"/>
-              </w:tabs>
-              <w:rPr>
-                <w:lang w:val="en-GB"/>
-              </w:rPr>
-            </w:pPr>
-            <w:r>
-              <w:rPr>
-                <w:lang w:val="en-GB"/>
-              </w:rPr>
-              <w:t>Digital Pin Arduino</w:t>
+              <w:t>Arduino Digital Output Pin</w:t>
             </w:r>
           </w:p>
         </w:tc>
@@ -4256,18 +4022,24 @@
           <w:bCs/>
           <w:lang w:val="en-GB"/>
         </w:rPr>
-        <w:t>VOLTAGE ANALYSIS</w:t>
-      </w:r>
-    </w:p>
-    <w:p>
-      <w:pPr>
-        <w:tabs>
-          <w:tab w:val="left" w:pos="2680"/>
-        </w:tabs>
-        <w:rPr>
-          <w:lang w:val="en-GB"/>
-        </w:rPr>
-      </w:pPr>
+        <w:t xml:space="preserve">VOLTAGE </w:t>
+      </w:r>
+      <w:r>
+        <w:rPr>
+          <w:b/>
+          <w:bCs/>
+          <w:lang w:val="en-GB"/>
+        </w:rPr>
+        <w:t xml:space="preserve">&amp; CURRENT </w:t>
+      </w:r>
+      <w:r>
+        <w:rPr>
+          <w:b/>
+          <w:bCs/>
+          <w:lang w:val="en-GB"/>
+        </w:rPr>
+        <w:t>ANALYSIS</w:t>
+      </w:r>
     </w:p>
     <w:tbl>
       <w:tblPr>
@@ -4481,7 +4253,7 @@
               <w:rPr>
                 <w:lang w:val="en-GB"/>
               </w:rPr>
-              <w:t>Motor Driver Power</w:t>
+              <w:t>Motor Driver Input Voltage</w:t>
             </w:r>
           </w:p>
         </w:tc>
@@ -4502,7 +4274,7 @@
               <w:rPr>
                 <w:lang w:val="en-GB"/>
               </w:rPr>
-              <w:t>4.5 V to 36 V</w:t>
+              <w:t>2.7 V to 10.8 V</w:t>
             </w:r>
           </w:p>
         </w:tc>
@@ -4525,7 +4297,7 @@
               <w:rPr>
                 <w:lang w:val="en-GB"/>
               </w:rPr>
-              <w:t>Motor Driver Enable</w:t>
+              <w:t>DC Motors</w:t>
             </w:r>
           </w:p>
         </w:tc>
@@ -4546,7 +4318,7 @@
               <w:rPr>
                 <w:lang w:val="en-GB"/>
               </w:rPr>
-              <w:t>5 V</w:t>
+              <w:t>3 V to 6 V</w:t>
             </w:r>
           </w:p>
         </w:tc>
@@ -4569,7 +4341,7 @@
               <w:rPr>
                 <w:lang w:val="en-GB"/>
               </w:rPr>
-              <w:t>DC Motors</w:t>
+              <w:t>Motor Driver Output</w:t>
             </w:r>
           </w:p>
         </w:tc>
@@ -4590,51 +4362,7 @@
               <w:rPr>
                 <w:lang w:val="en-GB"/>
               </w:rPr>
-              <w:t>3 V to 6 V</w:t>
-            </w:r>
-          </w:p>
-        </w:tc>
-      </w:tr>
-      <w:tr>
-        <w:tc>
-          <w:tcPr>
-            <w:tcW w:w="4508" w:type="dxa"/>
-          </w:tcPr>
-          <w:p>
-            <w:pPr>
-              <w:tabs>
-                <w:tab w:val="left" w:pos="2680"/>
-              </w:tabs>
-              <w:rPr>
-                <w:lang w:val="en-GB"/>
-              </w:rPr>
-            </w:pPr>
-            <w:r>
-              <w:rPr>
-                <w:lang w:val="en-GB"/>
-              </w:rPr>
-              <w:t>Motor Driver Output</w:t>
-            </w:r>
-          </w:p>
-        </w:tc>
-        <w:tc>
-          <w:tcPr>
-            <w:tcW w:w="4508" w:type="dxa"/>
-          </w:tcPr>
-          <w:p>
-            <w:pPr>
-              <w:tabs>
-                <w:tab w:val="left" w:pos="2680"/>
-              </w:tabs>
-              <w:rPr>
-                <w:lang w:val="en-GB"/>
-              </w:rPr>
-            </w:pPr>
-            <w:r>
-              <w:rPr>
-                <w:lang w:val="en-GB"/>
-              </w:rPr>
-              <w:t>VCC2 -1.4 V = 7.4 V -1.4 V = 6 V</w:t>
+              <w:t>7.4 V – 0.12 V = 7.28 V (must use PWM)</w:t>
             </w:r>
           </w:p>
         </w:tc>
@@ -4701,7 +4429,35 @@
           <w:iCs/>
           <w:lang w:val="en-GB"/>
         </w:rPr>
-        <w:t>** Voltage just in range (top end) for motors</w:t>
+        <w:t xml:space="preserve">** </w:t>
+      </w:r>
+      <w:r>
+        <w:rPr>
+          <w:i/>
+          <w:iCs/>
+          <w:lang w:val="en-GB"/>
+        </w:rPr>
+        <w:t>Motors will see roughly 7.28 V. Must drive DRV8833 with PWM signal so that it receives approximately 5 V. Measure with multimeter!</w:t>
+      </w:r>
+    </w:p>
+    <w:p>
+      <w:pPr>
+        <w:tabs>
+          <w:tab w:val="left" w:pos="2680"/>
+        </w:tabs>
+        <w:rPr>
+          <w:b/>
+          <w:bCs/>
+          <w:lang w:val="en-GB"/>
+        </w:rPr>
+      </w:pPr>
+      <w:r>
+        <w:rPr>
+          <w:b/>
+          <w:bCs/>
+          <w:lang w:val="en-GB"/>
+        </w:rPr>
+        <w:t>Current</w:t>
       </w:r>
     </w:p>
     <w:tbl>
@@ -4849,7 +4605,7 @@
               <w:rPr>
                 <w:lang w:val="en-GB"/>
               </w:rPr>
-              <w:t>600 mA</w:t>
+              <w:t>1.2 A (per motor)</w:t>
             </w:r>
           </w:p>
         </w:tc>
@@ -4937,21 +4693,183 @@
               <w:rPr>
                 <w:lang w:val="en-GB"/>
               </w:rPr>
-              <w:t xml:space="preserve">1.2 A (for 100 </w:t>
-            </w:r>
-            <w:proofErr w:type="spellStart"/>
-            <w:r>
-              <w:rPr>
-                <w:lang w:val="en-GB"/>
-              </w:rPr>
-              <w:t>uS</w:t>
-            </w:r>
-            <w:proofErr w:type="spellEnd"/>
-            <w:r>
-              <w:rPr>
-                <w:lang w:val="en-GB"/>
-              </w:rPr>
-              <w:t>)</w:t>
+              <w:t>2 A (per motor)</w:t>
+            </w:r>
+          </w:p>
+        </w:tc>
+      </w:tr>
+      <w:tr>
+        <w:tc>
+          <w:tcPr>
+            <w:tcW w:w="4508" w:type="dxa"/>
+          </w:tcPr>
+          <w:p>
+            <w:pPr>
+              <w:tabs>
+                <w:tab w:val="left" w:pos="2680"/>
+              </w:tabs>
+              <w:rPr>
+                <w:lang w:val="en-GB"/>
+              </w:rPr>
+            </w:pPr>
+            <w:r>
+              <w:rPr>
+                <w:lang w:val="en-GB"/>
+              </w:rPr>
+              <w:t>MPU6050 Current Draw</w:t>
+            </w:r>
+          </w:p>
+        </w:tc>
+        <w:tc>
+          <w:tcPr>
+            <w:tcW w:w="4508" w:type="dxa"/>
+          </w:tcPr>
+          <w:p>
+            <w:pPr>
+              <w:tabs>
+                <w:tab w:val="left" w:pos="2680"/>
+              </w:tabs>
+              <w:rPr>
+                <w:lang w:val="en-GB"/>
+              </w:rPr>
+            </w:pPr>
+            <w:r>
+              <w:rPr>
+                <w:lang w:val="en-GB"/>
+              </w:rPr>
+              <w:t>3.9 mA to 5.1 mA</w:t>
+            </w:r>
+          </w:p>
+        </w:tc>
+      </w:tr>
+      <w:tr>
+        <w:tc>
+          <w:tcPr>
+            <w:tcW w:w="4508" w:type="dxa"/>
+          </w:tcPr>
+          <w:p>
+            <w:pPr>
+              <w:tabs>
+                <w:tab w:val="left" w:pos="2680"/>
+              </w:tabs>
+              <w:rPr>
+                <w:lang w:val="en-GB"/>
+              </w:rPr>
+            </w:pPr>
+            <w:r>
+              <w:rPr>
+                <w:lang w:val="en-GB"/>
+              </w:rPr>
+              <w:t>Arduino Uno 5V Pin Current Limit</w:t>
+            </w:r>
+          </w:p>
+        </w:tc>
+        <w:tc>
+          <w:tcPr>
+            <w:tcW w:w="4508" w:type="dxa"/>
+          </w:tcPr>
+          <w:p>
+            <w:pPr>
+              <w:tabs>
+                <w:tab w:val="left" w:pos="2680"/>
+              </w:tabs>
+              <w:rPr>
+                <w:lang w:val="en-GB"/>
+              </w:rPr>
+            </w:pPr>
+            <w:r>
+              <w:rPr>
+                <w:lang w:val="en-GB"/>
+              </w:rPr>
+              <w:t>800 mA</w:t>
+            </w:r>
+          </w:p>
+        </w:tc>
+      </w:tr>
+      <w:tr>
+        <w:tc>
+          <w:tcPr>
+            <w:tcW w:w="4508" w:type="dxa"/>
+          </w:tcPr>
+          <w:p>
+            <w:pPr>
+              <w:tabs>
+                <w:tab w:val="left" w:pos="2680"/>
+              </w:tabs>
+              <w:rPr>
+                <w:lang w:val="en-GB"/>
+              </w:rPr>
+            </w:pPr>
+            <w:r>
+              <w:rPr>
+                <w:lang w:val="en-GB"/>
+              </w:rPr>
+              <w:t>Arduino Digital I/O Pins</w:t>
+            </w:r>
+          </w:p>
+        </w:tc>
+        <w:tc>
+          <w:tcPr>
+            <w:tcW w:w="4508" w:type="dxa"/>
+          </w:tcPr>
+          <w:p>
+            <w:pPr>
+              <w:tabs>
+                <w:tab w:val="left" w:pos="2680"/>
+              </w:tabs>
+              <w:rPr>
+                <w:lang w:val="en-GB"/>
+              </w:rPr>
+            </w:pPr>
+            <w:r>
+              <w:rPr>
+                <w:lang w:val="en-GB"/>
+              </w:rPr>
+              <w:t>20 mA (40 mA absolute max)</w:t>
+            </w:r>
+          </w:p>
+        </w:tc>
+      </w:tr>
+      <w:tr>
+        <w:tc>
+          <w:tcPr>
+            <w:tcW w:w="4508" w:type="dxa"/>
+          </w:tcPr>
+          <w:p>
+            <w:pPr>
+              <w:tabs>
+                <w:tab w:val="left" w:pos="2680"/>
+              </w:tabs>
+              <w:rPr>
+                <w:lang w:val="en-GB"/>
+              </w:rPr>
+            </w:pPr>
+            <w:r>
+              <w:rPr>
+                <w:lang w:val="en-GB"/>
+              </w:rPr>
+              <w:t>10k Potentiometer</w:t>
+            </w:r>
+          </w:p>
+        </w:tc>
+        <w:tc>
+          <w:tcPr>
+            <w:tcW w:w="4508" w:type="dxa"/>
+          </w:tcPr>
+          <w:p>
+            <w:pPr>
+              <w:tabs>
+                <w:tab w:val="left" w:pos="2680"/>
+              </w:tabs>
+              <w:rPr>
+                <w:lang w:val="en-GB"/>
+              </w:rPr>
+            </w:pPr>
+            <w:r>
+              <w:rPr>
+                <w:lang w:val="en-GB"/>
+              </w:rPr>
+              <w:t>0.5 mA</w:t>
             </w:r>
           </w:p>
         </w:tc>
@@ -4974,25 +4892,31 @@
           <w:iCs/>
           <w:lang w:val="en-GB"/>
         </w:rPr>
-        <w:t xml:space="preserve">** Peak current is exceeded but </w:t>
-      </w:r>
-      <w:proofErr w:type="gramStart"/>
+        <w:t xml:space="preserve">** Peak </w:t>
+      </w:r>
       <w:r>
         <w:rPr>
           <w:i/>
           <w:iCs/>
           <w:lang w:val="en-GB"/>
         </w:rPr>
-        <w:t>as long as</w:t>
-      </w:r>
-      <w:proofErr w:type="gramEnd"/>
+        <w:t xml:space="preserve">motor driver </w:t>
+      </w:r>
       <w:r>
         <w:rPr>
           <w:i/>
           <w:iCs/>
           <w:lang w:val="en-GB"/>
         </w:rPr>
-        <w:t xml:space="preserve"> the motors aren’t stalled this shouldn’t be a problem (also that tips and tricks video recommended this set up)</w:t>
+        <w:t xml:space="preserve">current is </w:t>
+      </w:r>
+      <w:r>
+        <w:rPr>
+          <w:i/>
+          <w:iCs/>
+          <w:lang w:val="en-GB"/>
+        </w:rPr>
+        <w:t>not exceeded. MPU6050 and Potentiometers can be powered from standard Arduino Digital Output pin.</w:t>
       </w:r>
     </w:p>
     <w:p>
@@ -5018,16 +4942,6 @@
         </w:rPr>
         <w:t>BILL OF MATERIALS</w:t>
       </w:r>
-    </w:p>
-    <w:p>
-      <w:pPr>
-        <w:tabs>
-          <w:tab w:val="left" w:pos="2680"/>
-        </w:tabs>
-        <w:rPr>
-          <w:lang w:val="en-GB"/>
-        </w:rPr>
-      </w:pPr>
     </w:p>
     <w:tbl>
       <w:tblPr>
@@ -5187,6 +5101,7 @@
               <w:rPr>
                 <w:lang w:val="en-GB"/>
               </w:rPr>
+              <w:lastRenderedPageBreak/>
               <w:t>Arduino Uno</w:t>
             </w:r>
           </w:p>
@@ -5208,7 +5123,7 @@
               <w:rPr>
                 <w:lang w:val="en-GB"/>
               </w:rPr>
-              <w:t>R125.01</w:t>
+              <w:t>R139</w:t>
             </w:r>
           </w:p>
         </w:tc>
@@ -5250,7 +5165,7 @@
               <w:rPr>
                 <w:lang w:val="en-GB"/>
               </w:rPr>
-              <w:t>R125.01</w:t>
+              <w:t>R139</w:t>
             </w:r>
           </w:p>
         </w:tc>
@@ -5267,8 +5182,113 @@
                 <w:lang w:val="en-GB"/>
               </w:rPr>
             </w:pPr>
-            <w:hyperlink r:id="rId31" w:history="1">
-              <w:proofErr w:type="spellStart"/>
+            <w:hyperlink r:id="rId32" w:history="1">
+              <w:r>
+                <w:rPr>
+                  <w:rStyle w:val="Hyperlink"/>
+                </w:rPr>
+                <w:t>Communica</w:t>
+              </w:r>
+            </w:hyperlink>
+          </w:p>
+        </w:tc>
+      </w:tr>
+      <w:tr>
+        <w:tc>
+          <w:tcPr>
+            <w:tcW w:w="2173" w:type="dxa"/>
+          </w:tcPr>
+          <w:p>
+            <w:pPr>
+              <w:tabs>
+                <w:tab w:val="left" w:pos="2680"/>
+              </w:tabs>
+            </w:pPr>
+            <w:r>
+              <w:rPr>
+                <w:lang w:val="en-GB"/>
+              </w:rPr>
+              <w:t>Breadboard</w:t>
+            </w:r>
+          </w:p>
+        </w:tc>
+        <w:tc>
+          <w:tcPr>
+            <w:tcW w:w="1774" w:type="dxa"/>
+          </w:tcPr>
+          <w:p>
+            <w:pPr>
+              <w:tabs>
+                <w:tab w:val="left" w:pos="2680"/>
+              </w:tabs>
+              <w:rPr>
+                <w:lang w:val="en-GB"/>
+              </w:rPr>
+            </w:pPr>
+            <w:r>
+              <w:rPr>
+                <w:lang w:val="en-GB"/>
+              </w:rPr>
+              <w:t>R15</w:t>
+            </w:r>
+          </w:p>
+        </w:tc>
+        <w:tc>
+          <w:tcPr>
+            <w:tcW w:w="1778" w:type="dxa"/>
+          </w:tcPr>
+          <w:p>
+            <w:pPr>
+              <w:tabs>
+                <w:tab w:val="left" w:pos="2680"/>
+              </w:tabs>
+              <w:rPr>
+                <w:lang w:val="en-GB"/>
+              </w:rPr>
+            </w:pPr>
+            <w:r>
+              <w:rPr>
+                <w:lang w:val="en-GB"/>
+              </w:rPr>
+              <w:t>1</w:t>
+            </w:r>
+          </w:p>
+        </w:tc>
+        <w:tc>
+          <w:tcPr>
+            <w:tcW w:w="1573" w:type="dxa"/>
+          </w:tcPr>
+          <w:p>
+            <w:pPr>
+              <w:tabs>
+                <w:tab w:val="left" w:pos="2680"/>
+              </w:tabs>
+              <w:rPr>
+                <w:lang w:val="en-GB"/>
+              </w:rPr>
+            </w:pPr>
+            <w:r>
+              <w:rPr>
+                <w:lang w:val="en-GB"/>
+              </w:rPr>
+              <w:t>R15</w:t>
+            </w:r>
+          </w:p>
+        </w:tc>
+        <w:tc>
+          <w:tcPr>
+            <w:tcW w:w="1718" w:type="dxa"/>
+          </w:tcPr>
+          <w:p>
+            <w:pPr>
+              <w:tabs>
+                <w:tab w:val="left" w:pos="2680"/>
+              </w:tabs>
+              <w:rPr>
+                <w:lang w:val="en-GB"/>
+              </w:rPr>
+            </w:pPr>
+            <w:hyperlink r:id="rId33" w:history="1">
               <w:r>
                 <w:rPr>
                   <w:rStyle w:val="Hyperlink"/>
@@ -5276,14 +5296,7 @@
                 </w:rPr>
                 <w:t>Communica</w:t>
               </w:r>
-              <w:proofErr w:type="spellEnd"/>
             </w:hyperlink>
-            <w:r>
-              <w:rPr>
-                <w:lang w:val="en-GB"/>
-              </w:rPr>
-              <w:t xml:space="preserve"> – Does it come with cable?</w:t>
-            </w:r>
           </w:p>
         </w:tc>
       </w:tr>
@@ -5302,7 +5315,7 @@
               <w:rPr>
                 <w:lang w:val="en-GB"/>
               </w:rPr>
-              <w:t>Breadboard</w:t>
+              <w:t>MPU6050</w:t>
             </w:r>
           </w:p>
         </w:tc>
@@ -5323,7 +5336,7 @@
               <w:rPr>
                 <w:lang w:val="en-GB"/>
               </w:rPr>
-              <w:t>R15</w:t>
+              <w:t>R60</w:t>
             </w:r>
           </w:p>
         </w:tc>
@@ -5365,7 +5378,7 @@
               <w:rPr>
                 <w:lang w:val="en-GB"/>
               </w:rPr>
-              <w:t>R15</w:t>
+              <w:t>R60</w:t>
             </w:r>
           </w:p>
         </w:tc>
@@ -5382,8 +5395,7 @@
                 <w:lang w:val="en-GB"/>
               </w:rPr>
             </w:pPr>
-            <w:hyperlink r:id="rId32" w:history="1">
-              <w:proofErr w:type="spellStart"/>
+            <w:hyperlink r:id="rId34" w:history="1">
               <w:r>
                 <w:rPr>
                   <w:rStyle w:val="Hyperlink"/>
@@ -5391,7 +5403,6 @@
                 </w:rPr>
                 <w:t>Communica</w:t>
               </w:r>
-              <w:proofErr w:type="spellEnd"/>
             </w:hyperlink>
           </w:p>
         </w:tc>
@@ -5406,12 +5417,15 @@
               <w:tabs>
                 <w:tab w:val="left" w:pos="2680"/>
               </w:tabs>
-            </w:pPr>
-            <w:r>
-              <w:rPr>
-                <w:lang w:val="en-GB"/>
-              </w:rPr>
-              <w:t>MPU6050</w:t>
+              <w:rPr>
+                <w:lang w:val="en-GB"/>
+              </w:rPr>
+            </w:pPr>
+            <w:r>
+              <w:rPr>
+                <w:lang w:val="en-GB"/>
+              </w:rPr>
+              <w:t>JST-Connector</w:t>
             </w:r>
           </w:p>
         </w:tc>
@@ -5432,7 +5446,7 @@
               <w:rPr>
                 <w:lang w:val="en-GB"/>
               </w:rPr>
-              <w:t>R60</w:t>
+              <w:t>R0.4</w:t>
             </w:r>
           </w:p>
         </w:tc>
@@ -5453,6 +5467,218 @@
               <w:rPr>
                 <w:lang w:val="en-GB"/>
               </w:rPr>
+              <w:t>3</w:t>
+            </w:r>
+          </w:p>
+        </w:tc>
+        <w:tc>
+          <w:tcPr>
+            <w:tcW w:w="1573" w:type="dxa"/>
+          </w:tcPr>
+          <w:p>
+            <w:pPr>
+              <w:tabs>
+                <w:tab w:val="left" w:pos="2680"/>
+              </w:tabs>
+              <w:rPr>
+                <w:lang w:val="en-GB"/>
+              </w:rPr>
+            </w:pPr>
+            <w:r>
+              <w:rPr>
+                <w:lang w:val="en-GB"/>
+              </w:rPr>
+              <w:t>R1.2</w:t>
+            </w:r>
+          </w:p>
+        </w:tc>
+        <w:tc>
+          <w:tcPr>
+            <w:tcW w:w="1718" w:type="dxa"/>
+          </w:tcPr>
+          <w:p>
+            <w:pPr>
+              <w:tabs>
+                <w:tab w:val="left" w:pos="2680"/>
+              </w:tabs>
+            </w:pPr>
+            <w:hyperlink r:id="rId35" w:history="1">
+              <w:r>
+                <w:rPr>
+                  <w:rStyle w:val="Hyperlink"/>
+                </w:rPr>
+                <w:t>Communica</w:t>
+              </w:r>
+            </w:hyperlink>
+          </w:p>
+        </w:tc>
+      </w:tr>
+      <w:tr>
+        <w:tc>
+          <w:tcPr>
+            <w:tcW w:w="2173" w:type="dxa"/>
+          </w:tcPr>
+          <w:p>
+            <w:pPr>
+              <w:tabs>
+                <w:tab w:val="left" w:pos="2680"/>
+              </w:tabs>
+              <w:rPr>
+                <w:lang w:val="en-GB"/>
+              </w:rPr>
+            </w:pPr>
+            <w:r>
+              <w:rPr>
+                <w:lang w:val="en-GB"/>
+              </w:rPr>
+              <w:t>Female Header</w:t>
+            </w:r>
+          </w:p>
+        </w:tc>
+        <w:tc>
+          <w:tcPr>
+            <w:tcW w:w="1774" w:type="dxa"/>
+          </w:tcPr>
+          <w:p>
+            <w:pPr>
+              <w:tabs>
+                <w:tab w:val="left" w:pos="2680"/>
+              </w:tabs>
+              <w:rPr>
+                <w:lang w:val="en-GB"/>
+              </w:rPr>
+            </w:pPr>
+            <w:r>
+              <w:rPr>
+                <w:lang w:val="en-GB"/>
+              </w:rPr>
+              <w:t>R3.39</w:t>
+            </w:r>
+          </w:p>
+        </w:tc>
+        <w:tc>
+          <w:tcPr>
+            <w:tcW w:w="1778" w:type="dxa"/>
+          </w:tcPr>
+          <w:p>
+            <w:pPr>
+              <w:tabs>
+                <w:tab w:val="left" w:pos="2680"/>
+              </w:tabs>
+              <w:rPr>
+                <w:lang w:val="en-GB"/>
+              </w:rPr>
+            </w:pPr>
+            <w:r>
+              <w:rPr>
+                <w:lang w:val="en-GB"/>
+              </w:rPr>
+              <w:t>2</w:t>
+            </w:r>
+          </w:p>
+        </w:tc>
+        <w:tc>
+          <w:tcPr>
+            <w:tcW w:w="1573" w:type="dxa"/>
+          </w:tcPr>
+          <w:p>
+            <w:pPr>
+              <w:tabs>
+                <w:tab w:val="left" w:pos="2680"/>
+              </w:tabs>
+              <w:rPr>
+                <w:lang w:val="en-GB"/>
+              </w:rPr>
+            </w:pPr>
+            <w:r>
+              <w:rPr>
+                <w:lang w:val="en-GB"/>
+              </w:rPr>
+              <w:t>R6.78</w:t>
+            </w:r>
+          </w:p>
+        </w:tc>
+        <w:tc>
+          <w:tcPr>
+            <w:tcW w:w="1718" w:type="dxa"/>
+          </w:tcPr>
+          <w:p>
+            <w:pPr>
+              <w:tabs>
+                <w:tab w:val="left" w:pos="2680"/>
+              </w:tabs>
+            </w:pPr>
+            <w:hyperlink r:id="rId36" w:history="1">
+              <w:r>
+                <w:rPr>
+                  <w:rStyle w:val="Hyperlink"/>
+                </w:rPr>
+                <w:t>Communica</w:t>
+              </w:r>
+            </w:hyperlink>
+          </w:p>
+        </w:tc>
+      </w:tr>
+      <w:tr>
+        <w:tc>
+          <w:tcPr>
+            <w:tcW w:w="2173" w:type="dxa"/>
+          </w:tcPr>
+          <w:p>
+            <w:pPr>
+              <w:tabs>
+                <w:tab w:val="left" w:pos="2680"/>
+              </w:tabs>
+              <w:rPr>
+                <w:lang w:val="en-GB"/>
+              </w:rPr>
+            </w:pPr>
+            <w:r>
+              <w:rPr>
+                <w:lang w:val="en-GB"/>
+              </w:rPr>
+              <w:t>DRV8833</w:t>
+            </w:r>
+          </w:p>
+        </w:tc>
+        <w:tc>
+          <w:tcPr>
+            <w:tcW w:w="1774" w:type="dxa"/>
+          </w:tcPr>
+          <w:p>
+            <w:pPr>
+              <w:tabs>
+                <w:tab w:val="left" w:pos="2680"/>
+              </w:tabs>
+              <w:rPr>
+                <w:lang w:val="en-GB"/>
+              </w:rPr>
+            </w:pPr>
+            <w:r>
+              <w:rPr>
+                <w:lang w:val="en-GB"/>
+              </w:rPr>
+              <w:t>R25</w:t>
+            </w:r>
+          </w:p>
+        </w:tc>
+        <w:tc>
+          <w:tcPr>
+            <w:tcW w:w="1778" w:type="dxa"/>
+          </w:tcPr>
+          <w:p>
+            <w:pPr>
+              <w:tabs>
+                <w:tab w:val="left" w:pos="2680"/>
+              </w:tabs>
+              <w:rPr>
+                <w:lang w:val="en-GB"/>
+              </w:rPr>
+            </w:pPr>
+            <w:r>
+              <w:rPr>
+                <w:lang w:val="en-GB"/>
+              </w:rPr>
               <w:t>1</w:t>
             </w:r>
           </w:p>
@@ -5474,7 +5700,7 @@
               <w:rPr>
                 <w:lang w:val="en-GB"/>
               </w:rPr>
-              <w:t>R60</w:t>
+              <w:t>R25</w:t>
             </w:r>
           </w:p>
         </w:tc>
@@ -5491,8 +5717,7 @@
                 <w:lang w:val="en-GB"/>
               </w:rPr>
             </w:pPr>
-            <w:hyperlink r:id="rId33" w:history="1">
-              <w:proofErr w:type="spellStart"/>
+            <w:hyperlink r:id="rId37" w:history="1">
               <w:r>
                 <w:rPr>
                   <w:rStyle w:val="Hyperlink"/>
@@ -5500,7 +5725,6 @@
                 </w:rPr>
                 <w:t>Communica</w:t>
               </w:r>
-              <w:proofErr w:type="spellEnd"/>
             </w:hyperlink>
           </w:p>
         </w:tc>
@@ -5508,6 +5732,67 @@
       <w:tr>
         <w:tc>
           <w:tcPr>
+            <w:tcW w:w="5725" w:type="dxa"/>
+            <w:gridSpan w:val="3"/>
+          </w:tcPr>
+          <w:p>
+            <w:pPr>
+              <w:tabs>
+                <w:tab w:val="left" w:pos="2680"/>
+              </w:tabs>
+              <w:rPr>
+                <w:b/>
+                <w:bCs/>
+                <w:lang w:val="en-GB"/>
+              </w:rPr>
+            </w:pPr>
+            <w:r>
+              <w:rPr>
+                <w:b/>
+                <w:bCs/>
+                <w:lang w:val="en-GB"/>
+              </w:rPr>
+              <w:t>Communica Total</w:t>
+            </w:r>
+          </w:p>
+        </w:tc>
+        <w:tc>
+          <w:tcPr>
+            <w:tcW w:w="3291" w:type="dxa"/>
+            <w:gridSpan w:val="2"/>
+          </w:tcPr>
+          <w:p>
+            <w:pPr>
+              <w:tabs>
+                <w:tab w:val="left" w:pos="2680"/>
+              </w:tabs>
+              <w:rPr>
+                <w:b/>
+                <w:bCs/>
+              </w:rPr>
+            </w:pPr>
+            <w:r>
+              <w:rPr>
+                <w:b/>
+                <w:bCs/>
+                <w:lang w:val="en-GB"/>
+              </w:rPr>
+              <w:t>R</w:t>
+            </w:r>
+            <w:r>
+              <w:rPr>
+                <w:b/>
+                <w:bCs/>
+                <w:lang w:val="en-GB"/>
+              </w:rPr>
+              <w:t>202.98</w:t>
+            </w:r>
+          </w:p>
+        </w:tc>
+      </w:tr>
+      <w:tr>
+        <w:tc>
+          <w:tcPr>
             <w:tcW w:w="2173" w:type="dxa"/>
           </w:tcPr>
           <w:p>
@@ -5523,7 +5808,7 @@
               <w:rPr>
                 <w:lang w:val="en-GB"/>
               </w:rPr>
-              <w:t>JST-Connector</w:t>
+              <w:t>Geared DC Motor</w:t>
             </w:r>
           </w:p>
         </w:tc>
@@ -5544,7 +5829,7 @@
               <w:rPr>
                 <w:lang w:val="en-GB"/>
               </w:rPr>
-              <w:t>R0.4</w:t>
+              <w:t>R48.26</w:t>
             </w:r>
           </w:p>
         </w:tc>
@@ -5565,7 +5850,7 @@
               <w:rPr>
                 <w:lang w:val="en-GB"/>
               </w:rPr>
-              <w:t>3</w:t>
+              <w:t>2</w:t>
             </w:r>
           </w:p>
         </w:tc>
@@ -5586,7 +5871,7 @@
               <w:rPr>
                 <w:lang w:val="en-GB"/>
               </w:rPr>
-              <w:t>R1.2</w:t>
+              <w:t>R97</w:t>
             </w:r>
           </w:p>
         </w:tc>
@@ -5599,16 +5884,18 @@
               <w:tabs>
                 <w:tab w:val="left" w:pos="2680"/>
               </w:tabs>
-            </w:pPr>
-            <w:hyperlink r:id="rId34" w:history="1">
-              <w:proofErr w:type="spellStart"/>
+              <w:rPr>
+                <w:lang w:val="en-GB"/>
+              </w:rPr>
+            </w:pPr>
+            <w:hyperlink r:id="rId38" w:history="1">
               <w:r>
                 <w:rPr>
                   <w:rStyle w:val="Hyperlink"/>
+                  <w:lang w:val="en-GB"/>
                 </w:rPr>
-                <w:t>Communica</w:t>
+                <w:t>Digikey</w:t>
               </w:r>
-              <w:proofErr w:type="spellEnd"/>
             </w:hyperlink>
           </w:p>
         </w:tc>
@@ -5631,7 +5918,7 @@
               <w:rPr>
                 <w:lang w:val="en-GB"/>
               </w:rPr>
-              <w:t>Female Header</w:t>
+              <w:t>Robot Wheel</w:t>
             </w:r>
           </w:p>
         </w:tc>
@@ -5652,7 +5939,7 @@
               <w:rPr>
                 <w:lang w:val="en-GB"/>
               </w:rPr>
-              <w:t>R3.39</w:t>
+              <w:t>R73.62</w:t>
             </w:r>
           </w:p>
         </w:tc>
@@ -5673,7 +5960,7 @@
               <w:rPr>
                 <w:lang w:val="en-GB"/>
               </w:rPr>
-              <w:t>2</w:t>
+              <w:t>1</w:t>
             </w:r>
           </w:p>
         </w:tc>
@@ -5694,7 +5981,7 @@
               <w:rPr>
                 <w:lang w:val="en-GB"/>
               </w:rPr>
-              <w:t>R6.78</w:t>
+              <w:t>R74</w:t>
             </w:r>
           </w:p>
         </w:tc>
@@ -5707,117 +5994,11 @@
               <w:tabs>
                 <w:tab w:val="left" w:pos="2680"/>
               </w:tabs>
-            </w:pPr>
-            <w:hyperlink r:id="rId35" w:history="1">
-              <w:proofErr w:type="spellStart"/>
-              <w:r>
-                <w:rPr>
-                  <w:rStyle w:val="Hyperlink"/>
-                </w:rPr>
-                <w:t>Communica</w:t>
-              </w:r>
-              <w:proofErr w:type="spellEnd"/>
-            </w:hyperlink>
-          </w:p>
-        </w:tc>
-      </w:tr>
-      <w:tr>
-        <w:tc>
-          <w:tcPr>
-            <w:tcW w:w="2173" w:type="dxa"/>
-          </w:tcPr>
-          <w:p>
-            <w:pPr>
-              <w:tabs>
-                <w:tab w:val="left" w:pos="2680"/>
-              </w:tabs>
-              <w:rPr>
-                <w:lang w:val="en-GB"/>
-              </w:rPr>
-            </w:pPr>
-            <w:r>
-              <w:t>L293D</w:t>
-            </w:r>
-          </w:p>
-        </w:tc>
-        <w:tc>
-          <w:tcPr>
-            <w:tcW w:w="1774" w:type="dxa"/>
-          </w:tcPr>
-          <w:p>
-            <w:pPr>
-              <w:tabs>
-                <w:tab w:val="left" w:pos="2680"/>
-              </w:tabs>
-              <w:rPr>
-                <w:lang w:val="en-GB"/>
-              </w:rPr>
-            </w:pPr>
-            <w:r>
-              <w:rPr>
-                <w:lang w:val="en-GB"/>
-              </w:rPr>
-              <w:t>R144.96</w:t>
-            </w:r>
-          </w:p>
-        </w:tc>
-        <w:tc>
-          <w:tcPr>
-            <w:tcW w:w="1778" w:type="dxa"/>
-          </w:tcPr>
-          <w:p>
-            <w:pPr>
-              <w:tabs>
-                <w:tab w:val="left" w:pos="2680"/>
-              </w:tabs>
-              <w:rPr>
-                <w:lang w:val="en-GB"/>
-              </w:rPr>
-            </w:pPr>
-            <w:r>
-              <w:rPr>
-                <w:lang w:val="en-GB"/>
-              </w:rPr>
-              <w:t>1</w:t>
-            </w:r>
-          </w:p>
-        </w:tc>
-        <w:tc>
-          <w:tcPr>
-            <w:tcW w:w="1573" w:type="dxa"/>
-          </w:tcPr>
-          <w:p>
-            <w:pPr>
-              <w:tabs>
-                <w:tab w:val="left" w:pos="2680"/>
-              </w:tabs>
-              <w:rPr>
-                <w:lang w:val="en-GB"/>
-              </w:rPr>
-            </w:pPr>
-            <w:r>
-              <w:rPr>
-                <w:lang w:val="en-GB"/>
-              </w:rPr>
-              <w:t>R144.96</w:t>
-            </w:r>
-          </w:p>
-        </w:tc>
-        <w:tc>
-          <w:tcPr>
-            <w:tcW w:w="1718" w:type="dxa"/>
-          </w:tcPr>
-          <w:p>
-            <w:pPr>
-              <w:tabs>
-                <w:tab w:val="left" w:pos="2680"/>
-              </w:tabs>
-              <w:rPr>
-                <w:lang w:val="en-GB"/>
-              </w:rPr>
-            </w:pPr>
-            <w:hyperlink r:id="rId36" w:history="1">
-              <w:proofErr w:type="spellStart"/>
+              <w:rPr>
+                <w:lang w:val="en-GB"/>
+              </w:rPr>
+            </w:pPr>
+            <w:hyperlink r:id="rId39" w:history="1">
               <w:r>
                 <w:rPr>
                   <w:rStyle w:val="Hyperlink"/>
@@ -5825,7 +6006,6 @@
                 </w:rPr>
                 <w:t>DigiKey</w:t>
               </w:r>
-              <w:proofErr w:type="spellEnd"/>
             </w:hyperlink>
           </w:p>
         </w:tc>
@@ -5848,7 +6028,7 @@
               <w:rPr>
                 <w:lang w:val="en-GB"/>
               </w:rPr>
-              <w:t>Geared DC Motor</w:t>
+              <w:t>Male Connectors</w:t>
             </w:r>
           </w:p>
         </w:tc>
@@ -5869,7 +6049,7 @@
               <w:rPr>
                 <w:lang w:val="en-GB"/>
               </w:rPr>
-              <w:t>R48.26</w:t>
+              <w:t>R31.90</w:t>
             </w:r>
           </w:p>
         </w:tc>
@@ -5890,7 +6070,7 @@
               <w:rPr>
                 <w:lang w:val="en-GB"/>
               </w:rPr>
-              <w:t>2</w:t>
+              <w:t>1</w:t>
             </w:r>
           </w:p>
         </w:tc>
@@ -5911,7 +6091,7 @@
               <w:rPr>
                 <w:lang w:val="en-GB"/>
               </w:rPr>
-              <w:t>R97</w:t>
+              <w:t>R31.90</w:t>
             </w:r>
           </w:p>
         </w:tc>
@@ -5928,120 +6108,7 @@
                 <w:lang w:val="en-GB"/>
               </w:rPr>
             </w:pPr>
-            <w:hyperlink r:id="rId37" w:history="1">
-              <w:proofErr w:type="spellStart"/>
-              <w:r>
-                <w:rPr>
-                  <w:rStyle w:val="Hyperlink"/>
-                  <w:lang w:val="en-GB"/>
-                </w:rPr>
-                <w:t>Digikey</w:t>
-              </w:r>
-              <w:proofErr w:type="spellEnd"/>
-            </w:hyperlink>
-          </w:p>
-        </w:tc>
-      </w:tr>
-      <w:tr>
-        <w:tc>
-          <w:tcPr>
-            <w:tcW w:w="2173" w:type="dxa"/>
-          </w:tcPr>
-          <w:p>
-            <w:pPr>
-              <w:tabs>
-                <w:tab w:val="left" w:pos="2680"/>
-              </w:tabs>
-              <w:rPr>
-                <w:lang w:val="en-GB"/>
-              </w:rPr>
-            </w:pPr>
-            <w:r>
-              <w:rPr>
-                <w:lang w:val="en-GB"/>
-              </w:rPr>
-              <w:t>Robot Wheel</w:t>
-            </w:r>
-          </w:p>
-        </w:tc>
-        <w:tc>
-          <w:tcPr>
-            <w:tcW w:w="1774" w:type="dxa"/>
-          </w:tcPr>
-          <w:p>
-            <w:pPr>
-              <w:tabs>
-                <w:tab w:val="left" w:pos="2680"/>
-              </w:tabs>
-              <w:rPr>
-                <w:lang w:val="en-GB"/>
-              </w:rPr>
-            </w:pPr>
-            <w:r>
-              <w:rPr>
-                <w:lang w:val="en-GB"/>
-              </w:rPr>
-              <w:t>R73.62</w:t>
-            </w:r>
-          </w:p>
-        </w:tc>
-        <w:tc>
-          <w:tcPr>
-            <w:tcW w:w="1778" w:type="dxa"/>
-          </w:tcPr>
-          <w:p>
-            <w:pPr>
-              <w:tabs>
-                <w:tab w:val="left" w:pos="2680"/>
-              </w:tabs>
-              <w:rPr>
-                <w:lang w:val="en-GB"/>
-              </w:rPr>
-            </w:pPr>
-            <w:r>
-              <w:rPr>
-                <w:lang w:val="en-GB"/>
-              </w:rPr>
-              <w:t>1</w:t>
-            </w:r>
-          </w:p>
-        </w:tc>
-        <w:tc>
-          <w:tcPr>
-            <w:tcW w:w="1573" w:type="dxa"/>
-          </w:tcPr>
-          <w:p>
-            <w:pPr>
-              <w:tabs>
-                <w:tab w:val="left" w:pos="2680"/>
-              </w:tabs>
-              <w:rPr>
-                <w:lang w:val="en-GB"/>
-              </w:rPr>
-            </w:pPr>
-            <w:r>
-              <w:rPr>
-                <w:lang w:val="en-GB"/>
-              </w:rPr>
-              <w:t>R74</w:t>
-            </w:r>
-          </w:p>
-        </w:tc>
-        <w:tc>
-          <w:tcPr>
-            <w:tcW w:w="1718" w:type="dxa"/>
-          </w:tcPr>
-          <w:p>
-            <w:pPr>
-              <w:tabs>
-                <w:tab w:val="left" w:pos="2680"/>
-              </w:tabs>
-              <w:rPr>
-                <w:lang w:val="en-GB"/>
-              </w:rPr>
-            </w:pPr>
-            <w:hyperlink r:id="rId38" w:history="1">
-              <w:proofErr w:type="spellStart"/>
+            <w:hyperlink r:id="rId40" w:history="1">
               <w:r>
                 <w:rPr>
                   <w:rStyle w:val="Hyperlink"/>
@@ -6049,7 +6116,6 @@
                 </w:rPr>
                 <w:t>DigiKey</w:t>
               </w:r>
-              <w:proofErr w:type="spellEnd"/>
             </w:hyperlink>
           </w:p>
         </w:tc>
@@ -6072,7 +6138,7 @@
               <w:rPr>
                 <w:lang w:val="en-GB"/>
               </w:rPr>
-              <w:t>Male Connectors</w:t>
+              <w:t>Button</w:t>
             </w:r>
           </w:p>
         </w:tc>
@@ -6093,7 +6159,7 @@
               <w:rPr>
                 <w:lang w:val="en-GB"/>
               </w:rPr>
-              <w:t>R31.90</w:t>
+              <w:t>R4.91</w:t>
             </w:r>
           </w:p>
         </w:tc>
@@ -6114,7 +6180,7 @@
               <w:rPr>
                 <w:lang w:val="en-GB"/>
               </w:rPr>
-              <w:t>1</w:t>
+              <w:t>5</w:t>
             </w:r>
           </w:p>
         </w:tc>
@@ -6135,7 +6201,7 @@
               <w:rPr>
                 <w:lang w:val="en-GB"/>
               </w:rPr>
-              <w:t>R31.90</w:t>
+              <w:t>R24.55</w:t>
             </w:r>
           </w:p>
         </w:tc>
@@ -6148,20 +6214,14 @@
               <w:tabs>
                 <w:tab w:val="left" w:pos="2680"/>
               </w:tabs>
-              <w:rPr>
-                <w:lang w:val="en-GB"/>
-              </w:rPr>
-            </w:pPr>
-            <w:hyperlink r:id="rId39" w:history="1">
-              <w:proofErr w:type="spellStart"/>
+            </w:pPr>
+            <w:hyperlink r:id="rId41" w:history="1">
               <w:r>
                 <w:rPr>
                   <w:rStyle w:val="Hyperlink"/>
-                  <w:lang w:val="en-GB"/>
                 </w:rPr>
                 <w:t>DigiKey</w:t>
               </w:r>
-              <w:proofErr w:type="spellEnd"/>
             </w:hyperlink>
           </w:p>
         </w:tc>
@@ -6184,6 +6244,187 @@
               <w:rPr>
                 <w:lang w:val="en-GB"/>
               </w:rPr>
+              <w:t>Vero Board</w:t>
+            </w:r>
+          </w:p>
+        </w:tc>
+        <w:tc>
+          <w:tcPr>
+            <w:tcW w:w="1774" w:type="dxa"/>
+          </w:tcPr>
+          <w:p>
+            <w:pPr>
+              <w:tabs>
+                <w:tab w:val="left" w:pos="2680"/>
+              </w:tabs>
+              <w:rPr>
+                <w:lang w:val="en-GB"/>
+              </w:rPr>
+            </w:pPr>
+            <w:r>
+              <w:rPr>
+                <w:lang w:val="en-GB"/>
+              </w:rPr>
+              <w:t>R</w:t>
+            </w:r>
+            <w:r>
+              <w:rPr>
+                <w:lang w:val="en-GB"/>
+              </w:rPr>
+              <w:t>57.26</w:t>
+            </w:r>
+          </w:p>
+        </w:tc>
+        <w:tc>
+          <w:tcPr>
+            <w:tcW w:w="1778" w:type="dxa"/>
+          </w:tcPr>
+          <w:p>
+            <w:pPr>
+              <w:tabs>
+                <w:tab w:val="left" w:pos="2680"/>
+              </w:tabs>
+              <w:rPr>
+                <w:lang w:val="en-GB"/>
+              </w:rPr>
+            </w:pPr>
+            <w:r>
+              <w:rPr>
+                <w:lang w:val="en-GB"/>
+              </w:rPr>
+              <w:t>1</w:t>
+            </w:r>
+          </w:p>
+        </w:tc>
+        <w:tc>
+          <w:tcPr>
+            <w:tcW w:w="1573" w:type="dxa"/>
+          </w:tcPr>
+          <w:p>
+            <w:pPr>
+              <w:tabs>
+                <w:tab w:val="left" w:pos="2680"/>
+              </w:tabs>
+              <w:rPr>
+                <w:lang w:val="en-GB"/>
+              </w:rPr>
+            </w:pPr>
+            <w:r>
+              <w:rPr>
+                <w:lang w:val="en-GB"/>
+              </w:rPr>
+              <w:t>R57.26</w:t>
+            </w:r>
+          </w:p>
+        </w:tc>
+        <w:tc>
+          <w:tcPr>
+            <w:tcW w:w="1718" w:type="dxa"/>
+          </w:tcPr>
+          <w:p>
+            <w:pPr>
+              <w:tabs>
+                <w:tab w:val="left" w:pos="2680"/>
+              </w:tabs>
+            </w:pPr>
+            <w:hyperlink r:id="rId42" w:history="1">
+              <w:r>
+                <w:rPr>
+                  <w:rStyle w:val="Hyperlink"/>
+                </w:rPr>
+                <w:t>DigiKey</w:t>
+              </w:r>
+            </w:hyperlink>
+          </w:p>
+        </w:tc>
+      </w:tr>
+      <w:tr>
+        <w:tc>
+          <w:tcPr>
+            <w:tcW w:w="5725" w:type="dxa"/>
+            <w:gridSpan w:val="3"/>
+          </w:tcPr>
+          <w:p>
+            <w:pPr>
+              <w:tabs>
+                <w:tab w:val="left" w:pos="2680"/>
+              </w:tabs>
+              <w:rPr>
+                <w:b/>
+                <w:bCs/>
+                <w:lang w:val="en-GB"/>
+              </w:rPr>
+            </w:pPr>
+            <w:r>
+              <w:rPr>
+                <w:b/>
+                <w:bCs/>
+                <w:lang w:val="en-GB"/>
+              </w:rPr>
+              <w:t>DigiKey Total</w:t>
+            </w:r>
+          </w:p>
+        </w:tc>
+        <w:tc>
+          <w:tcPr>
+            <w:tcW w:w="3291" w:type="dxa"/>
+            <w:gridSpan w:val="2"/>
+          </w:tcPr>
+          <w:p>
+            <w:pPr>
+              <w:tabs>
+                <w:tab w:val="left" w:pos="2680"/>
+              </w:tabs>
+              <w:rPr>
+                <w:b/>
+                <w:bCs/>
+              </w:rPr>
+            </w:pPr>
+            <w:r>
+              <w:rPr>
+                <w:b/>
+                <w:bCs/>
+                <w:lang w:val="en-GB"/>
+              </w:rPr>
+              <w:t>R</w:t>
+            </w:r>
+            <w:r>
+              <w:rPr>
+                <w:b/>
+                <w:bCs/>
+                <w:lang w:val="en-GB"/>
+              </w:rPr>
+              <w:t>2</w:t>
+            </w:r>
+            <w:r>
+              <w:rPr>
+                <w:b/>
+                <w:bCs/>
+                <w:lang w:val="en-GB"/>
+              </w:rPr>
+              <w:t>84.71</w:t>
+            </w:r>
+          </w:p>
+        </w:tc>
+      </w:tr>
+      <w:tr>
+        <w:tc>
+          <w:tcPr>
+            <w:tcW w:w="2173" w:type="dxa"/>
+          </w:tcPr>
+          <w:p>
+            <w:pPr>
+              <w:tabs>
+                <w:tab w:val="left" w:pos="2680"/>
+              </w:tabs>
+              <w:rPr>
+                <w:lang w:val="en-GB"/>
+              </w:rPr>
+            </w:pPr>
+            <w:r>
+              <w:rPr>
+                <w:lang w:val="en-GB"/>
+              </w:rPr>
               <w:t>Battery</w:t>
             </w:r>
           </w:p>
@@ -6264,8 +6505,7 @@
                 <w:lang w:val="en-GB"/>
               </w:rPr>
             </w:pPr>
-            <w:hyperlink r:id="rId40" w:history="1">
-              <w:proofErr w:type="spellStart"/>
+            <w:hyperlink r:id="rId43" w:history="1">
               <w:r>
                 <w:rPr>
                   <w:rStyle w:val="Hyperlink"/>
@@ -6273,7 +6513,6 @@
                 </w:rPr>
                 <w:t>Microrobotics</w:t>
               </w:r>
-              <w:proofErr w:type="spellEnd"/>
             </w:hyperlink>
           </w:p>
         </w:tc>
@@ -6381,8 +6620,7 @@
                 <w:lang w:val="en-GB"/>
               </w:rPr>
             </w:pPr>
-            <w:hyperlink r:id="rId41" w:history="1">
-              <w:proofErr w:type="spellStart"/>
+            <w:hyperlink r:id="rId44" w:history="1">
               <w:r>
                 <w:rPr>
                   <w:rStyle w:val="Hyperlink"/>
@@ -6390,7 +6628,6 @@
                 </w:rPr>
                 <w:t>Microrobotics</w:t>
               </w:r>
-              <w:proofErr w:type="spellEnd"/>
             </w:hyperlink>
           </w:p>
         </w:tc>
@@ -6398,6 +6635,228 @@
       <w:tr>
         <w:tc>
           <w:tcPr>
+            <w:tcW w:w="2173" w:type="dxa"/>
+          </w:tcPr>
+          <w:p>
+            <w:pPr>
+              <w:tabs>
+                <w:tab w:val="left" w:pos="2680"/>
+              </w:tabs>
+              <w:jc w:val="both"/>
+              <w:rPr>
+                <w:lang w:val="en-GB"/>
+              </w:rPr>
+            </w:pPr>
+            <w:r>
+              <w:rPr>
+                <w:lang w:val="en-GB"/>
+              </w:rPr>
+              <w:t>Potentiometer</w:t>
+            </w:r>
+          </w:p>
+        </w:tc>
+        <w:tc>
+          <w:tcPr>
+            <w:tcW w:w="1774" w:type="dxa"/>
+          </w:tcPr>
+          <w:p>
+            <w:pPr>
+              <w:tabs>
+                <w:tab w:val="left" w:pos="2680"/>
+              </w:tabs>
+              <w:jc w:val="both"/>
+              <w:rPr>
+                <w:lang w:val="en-GB"/>
+              </w:rPr>
+            </w:pPr>
+            <w:r>
+              <w:rPr>
+                <w:lang w:val="en-GB"/>
+              </w:rPr>
+              <w:t>R23</w:t>
+            </w:r>
+          </w:p>
+        </w:tc>
+        <w:tc>
+          <w:tcPr>
+            <w:tcW w:w="1778" w:type="dxa"/>
+          </w:tcPr>
+          <w:p>
+            <w:pPr>
+              <w:tabs>
+                <w:tab w:val="left" w:pos="2680"/>
+              </w:tabs>
+              <w:jc w:val="both"/>
+              <w:rPr>
+                <w:lang w:val="en-GB"/>
+              </w:rPr>
+            </w:pPr>
+            <w:r>
+              <w:rPr>
+                <w:lang w:val="en-GB"/>
+              </w:rPr>
+              <w:t>1</w:t>
+            </w:r>
+          </w:p>
+        </w:tc>
+        <w:tc>
+          <w:tcPr>
+            <w:tcW w:w="1573" w:type="dxa"/>
+          </w:tcPr>
+          <w:p>
+            <w:pPr>
+              <w:tabs>
+                <w:tab w:val="left" w:pos="2680"/>
+              </w:tabs>
+              <w:jc w:val="both"/>
+              <w:rPr>
+                <w:lang w:val="en-GB"/>
+              </w:rPr>
+            </w:pPr>
+            <w:r>
+              <w:rPr>
+                <w:lang w:val="en-GB"/>
+              </w:rPr>
+              <w:t>R23</w:t>
+            </w:r>
+          </w:p>
+        </w:tc>
+        <w:tc>
+          <w:tcPr>
+            <w:tcW w:w="1718" w:type="dxa"/>
+          </w:tcPr>
+          <w:p>
+            <w:pPr>
+              <w:tabs>
+                <w:tab w:val="left" w:pos="2680"/>
+              </w:tabs>
+              <w:jc w:val="both"/>
+            </w:pPr>
+            <w:hyperlink r:id="rId45" w:history="1">
+              <w:r>
+                <w:rPr>
+                  <w:rStyle w:val="Hyperlink"/>
+                </w:rPr>
+                <w:t>Microrobotics</w:t>
+              </w:r>
+            </w:hyperlink>
+          </w:p>
+        </w:tc>
+      </w:tr>
+      <w:tr>
+        <w:tc>
+          <w:tcPr>
+            <w:tcW w:w="2173" w:type="dxa"/>
+          </w:tcPr>
+          <w:p>
+            <w:pPr>
+              <w:tabs>
+                <w:tab w:val="left" w:pos="2680"/>
+              </w:tabs>
+              <w:jc w:val="both"/>
+              <w:rPr>
+                <w:lang w:val="en-GB"/>
+              </w:rPr>
+            </w:pPr>
+            <w:r>
+              <w:rPr>
+                <w:lang w:val="en-GB"/>
+              </w:rPr>
+              <w:t>Switch</w:t>
+            </w:r>
+          </w:p>
+        </w:tc>
+        <w:tc>
+          <w:tcPr>
+            <w:tcW w:w="1774" w:type="dxa"/>
+          </w:tcPr>
+          <w:p>
+            <w:pPr>
+              <w:tabs>
+                <w:tab w:val="left" w:pos="2680"/>
+              </w:tabs>
+              <w:jc w:val="both"/>
+              <w:rPr>
+                <w:lang w:val="en-GB"/>
+              </w:rPr>
+            </w:pPr>
+            <w:r>
+              <w:rPr>
+                <w:lang w:val="en-GB"/>
+              </w:rPr>
+              <w:t>R16.10</w:t>
+            </w:r>
+          </w:p>
+        </w:tc>
+        <w:tc>
+          <w:tcPr>
+            <w:tcW w:w="1778" w:type="dxa"/>
+          </w:tcPr>
+          <w:p>
+            <w:pPr>
+              <w:tabs>
+                <w:tab w:val="left" w:pos="2680"/>
+              </w:tabs>
+              <w:jc w:val="both"/>
+              <w:rPr>
+                <w:lang w:val="en-GB"/>
+              </w:rPr>
+            </w:pPr>
+            <w:r>
+              <w:rPr>
+                <w:lang w:val="en-GB"/>
+              </w:rPr>
+              <w:t>1</w:t>
+            </w:r>
+          </w:p>
+        </w:tc>
+        <w:tc>
+          <w:tcPr>
+            <w:tcW w:w="1573" w:type="dxa"/>
+          </w:tcPr>
+          <w:p>
+            <w:pPr>
+              <w:tabs>
+                <w:tab w:val="left" w:pos="2680"/>
+              </w:tabs>
+              <w:jc w:val="both"/>
+              <w:rPr>
+                <w:lang w:val="en-GB"/>
+              </w:rPr>
+            </w:pPr>
+            <w:r>
+              <w:rPr>
+                <w:lang w:val="en-GB"/>
+              </w:rPr>
+              <w:t>R16.10</w:t>
+            </w:r>
+          </w:p>
+        </w:tc>
+        <w:tc>
+          <w:tcPr>
+            <w:tcW w:w="1718" w:type="dxa"/>
+          </w:tcPr>
+          <w:p>
+            <w:pPr>
+              <w:tabs>
+                <w:tab w:val="left" w:pos="2680"/>
+              </w:tabs>
+              <w:jc w:val="both"/>
+            </w:pPr>
+            <w:hyperlink r:id="rId46" w:history="1">
+              <w:r>
+                <w:rPr>
+                  <w:rStyle w:val="Hyperlink"/>
+                </w:rPr>
+                <w:t>Microrobotics</w:t>
+              </w:r>
+            </w:hyperlink>
+          </w:p>
+        </w:tc>
+      </w:tr>
+      <w:tr>
+        <w:tc>
+          <w:tcPr>
             <w:tcW w:w="5725" w:type="dxa"/>
             <w:gridSpan w:val="3"/>
           </w:tcPr>
@@ -6406,7 +6865,7 @@
               <w:tabs>
                 <w:tab w:val="left" w:pos="2680"/>
               </w:tabs>
-              <w:jc w:val="center"/>
+              <w:jc w:val="both"/>
               <w:rPr>
                 <w:b/>
                 <w:bCs/>
@@ -6419,13 +6878,14 @@
                 <w:bCs/>
                 <w:lang w:val="en-GB"/>
               </w:rPr>
-              <w:t>Total</w:t>
-            </w:r>
-          </w:p>
-        </w:tc>
-        <w:tc>
-          <w:tcPr>
-            <w:tcW w:w="1573" w:type="dxa"/>
+              <w:t>Microrobotics Total</w:t>
+            </w:r>
+          </w:p>
+        </w:tc>
+        <w:tc>
+          <w:tcPr>
+            <w:tcW w:w="3291" w:type="dxa"/>
+            <w:gridSpan w:val="2"/>
           </w:tcPr>
           <w:p>
             <w:pPr>
@@ -6436,7 +6896,6 @@
               <w:rPr>
                 <w:b/>
                 <w:bCs/>
-                <w:lang w:val="en-GB"/>
               </w:rPr>
             </w:pPr>
             <w:r>
@@ -6445,7 +6904,62 @@
                 <w:bCs/>
                 <w:lang w:val="en-GB"/>
               </w:rPr>
-              <w:t>R793.85</w:t>
+              <w:t>R277.10</w:t>
+            </w:r>
+          </w:p>
+        </w:tc>
+      </w:tr>
+      <w:tr>
+        <w:tc>
+          <w:tcPr>
+            <w:tcW w:w="5725" w:type="dxa"/>
+            <w:gridSpan w:val="3"/>
+          </w:tcPr>
+          <w:p>
+            <w:pPr>
+              <w:tabs>
+                <w:tab w:val="left" w:pos="2680"/>
+              </w:tabs>
+              <w:jc w:val="center"/>
+              <w:rPr>
+                <w:b/>
+                <w:bCs/>
+                <w:lang w:val="en-GB"/>
+              </w:rPr>
+            </w:pPr>
+            <w:r>
+              <w:rPr>
+                <w:b/>
+                <w:bCs/>
+                <w:lang w:val="en-GB"/>
+              </w:rPr>
+              <w:t>Total</w:t>
+            </w:r>
+          </w:p>
+        </w:tc>
+        <w:tc>
+          <w:tcPr>
+            <w:tcW w:w="1573" w:type="dxa"/>
+          </w:tcPr>
+          <w:p>
+            <w:pPr>
+              <w:tabs>
+                <w:tab w:val="left" w:pos="614"/>
+              </w:tabs>
+              <w:jc w:val="both"/>
+              <w:rPr>
+                <w:b/>
+                <w:bCs/>
+                <w:lang w:val="en-GB"/>
+              </w:rPr>
+            </w:pPr>
+            <w:r>
+              <w:rPr>
+                <w:b/>
+                <w:bCs/>
+                <w:lang w:val="en-GB"/>
+              </w:rPr>
+              <w:t>R</w:t>
             </w:r>
           </w:p>
         </w:tc>
@@ -6520,7 +7034,7 @@
           <w:bCs/>
           <w:lang w:val="en-GB"/>
         </w:rPr>
-        <w:t>Kalman Filter</w:t>
+        <w:t>Complementary Filter vs Kalman Filter</w:t>
       </w:r>
     </w:p>
     <w:p>
@@ -6530,11 +7044,128 @@
           <w:ilvl w:val="0"/>
           <w:numId w:val="4"/>
         </w:numPr>
-        <w:rPr>
-          <w:lang w:val="en-GB"/>
-        </w:rPr>
-      </w:pPr>
-      <w:hyperlink r:id="rId42" w:history="1">
+        <w:tabs>
+          <w:tab w:val="left" w:pos="2680"/>
+        </w:tabs>
+        <w:rPr>
+          <w:lang w:val="en-GB"/>
+        </w:rPr>
+      </w:pPr>
+      <w:r>
+        <w:t xml:space="preserve">Both are sensor fusion algorithms used primarily to combine gyroscope and accelerometer data. The main difference is that a </w:t>
+      </w:r>
+      <w:r>
+        <w:rPr>
+          <w:b/>
+          <w:bCs/>
+        </w:rPr>
+        <w:t>Complementary Filter</w:t>
+      </w:r>
+      <w:r>
+        <w:t xml:space="preserve"> is a simple, computationally light, heuristic approach, whereas a </w:t>
+      </w:r>
+      <w:r>
+        <w:rPr>
+          <w:b/>
+          <w:bCs/>
+        </w:rPr>
+        <w:t>Kalman Filter</w:t>
+      </w:r>
+      <w:r>
+        <w:t xml:space="preserve"> is an advanced, probabilistic method that dynamically adjusts based on noise and uncertainty.</w:t>
+      </w:r>
+    </w:p>
+    <w:p>
+      <w:pPr>
+        <w:tabs>
+          <w:tab w:val="left" w:pos="2680"/>
+        </w:tabs>
+        <w:rPr>
+          <w:b/>
+          <w:bCs/>
+          <w:lang w:val="en-GB"/>
+        </w:rPr>
+      </w:pPr>
+      <w:r>
+        <w:rPr>
+          <w:b/>
+          <w:bCs/>
+          <w:lang w:val="en-GB"/>
+        </w:rPr>
+        <w:t>Complementary Filter</w:t>
+      </w:r>
+    </w:p>
+    <w:p>
+      <w:pPr>
+        <w:pStyle w:val="ListParagraph"/>
+        <w:numPr>
+          <w:ilvl w:val="0"/>
+          <w:numId w:val="4"/>
+        </w:numPr>
+        <w:tabs>
+          <w:tab w:val="left" w:pos="2680"/>
+        </w:tabs>
+        <w:rPr>
+          <w:lang w:val="en-GB"/>
+        </w:rPr>
+      </w:pPr>
+      <w:r>
+        <w:rPr>
+          <w:lang w:val="en-GB"/>
+        </w:rPr>
+        <w:t>Implementation goes here.</w:t>
+      </w:r>
+    </w:p>
+    <w:p>
+      <w:pPr>
+        <w:tabs>
+          <w:tab w:val="left" w:pos="2680"/>
+        </w:tabs>
+        <w:rPr>
+          <w:b/>
+          <w:bCs/>
+          <w:lang w:val="en-GB"/>
+        </w:rPr>
+      </w:pPr>
+      <w:r>
+        <w:rPr>
+          <w:b/>
+          <w:bCs/>
+          <w:lang w:val="en-GB"/>
+        </w:rPr>
+        <w:t>Kalman Filter</w:t>
+      </w:r>
+    </w:p>
+    <w:p>
+      <w:pPr>
+        <w:pStyle w:val="ListParagraph"/>
+        <w:numPr>
+          <w:ilvl w:val="0"/>
+          <w:numId w:val="4"/>
+        </w:numPr>
+        <w:rPr>
+          <w:lang w:val="en-GB"/>
+        </w:rPr>
+      </w:pPr>
+      <w:r>
+        <w:rPr>
+          <w:lang w:val="en-GB"/>
+        </w:rPr>
+        <w:t>Can try Complementary first and maybe improve with Kalman later.</w:t>
+      </w:r>
+    </w:p>
+    <w:p>
+      <w:pPr>
+        <w:pStyle w:val="ListParagraph"/>
+        <w:numPr>
+          <w:ilvl w:val="0"/>
+          <w:numId w:val="4"/>
+        </w:numPr>
+        <w:rPr>
+          <w:lang w:val="en-GB"/>
+        </w:rPr>
+      </w:pPr>
+      <w:hyperlink r:id="rId47" w:history="1">
         <w:r>
           <w:rPr>
             <w:rStyle w:val="Hyperlink"/>
@@ -6564,20 +7195,169 @@
           <w:bCs/>
           <w:lang w:val="en-GB"/>
         </w:rPr>
+        <w:t>Motor Driver</w:t>
+      </w:r>
+    </w:p>
+    <w:p>
+      <w:pPr>
+        <w:pStyle w:val="ListParagraph"/>
+        <w:numPr>
+          <w:ilvl w:val="0"/>
+          <w:numId w:val="4"/>
+        </w:numPr>
+        <w:rPr>
+          <w:lang w:val="en-GB"/>
+        </w:rPr>
+      </w:pPr>
+      <w:r>
+        <w:rPr>
+          <w:lang w:val="en-GB"/>
+        </w:rPr>
+        <w:t>analogWrite(pin, value)</w:t>
+      </w:r>
+    </w:p>
+    <w:p>
+      <w:pPr>
+        <w:pStyle w:val="ListParagraph"/>
+        <w:numPr>
+          <w:ilvl w:val="0"/>
+          <w:numId w:val="4"/>
+        </w:numPr>
+        <w:rPr>
+          <w:lang w:val="en-GB"/>
+        </w:rPr>
+      </w:pPr>
+      <w:r>
+        <w:rPr>
+          <w:lang w:val="en-GB"/>
+        </w:rPr>
+        <w:t>Pin must be a PWM-capable pin (marked with ~ symbol)</w:t>
+      </w:r>
+    </w:p>
+    <w:p>
+      <w:pPr>
+        <w:pStyle w:val="ListParagraph"/>
+        <w:numPr>
+          <w:ilvl w:val="0"/>
+          <w:numId w:val="4"/>
+        </w:numPr>
+        <w:rPr>
+          <w:lang w:val="en-GB"/>
+        </w:rPr>
+      </w:pPr>
+      <w:r>
+        <w:rPr>
+          <w:lang w:val="en-GB"/>
+        </w:rPr>
+        <w:t>Value: an integer from 0 to 255 (0 means 0 V or 0 % duty cycle and 255 means 5 V or 100 % duty cycle)</w:t>
+      </w:r>
+    </w:p>
+    <w:p>
+      <w:pPr>
+        <w:pStyle w:val="ListParagraph"/>
+        <w:numPr>
+          <w:ilvl w:val="0"/>
+          <w:numId w:val="4"/>
+        </w:numPr>
+        <w:rPr>
+          <w:lang w:val="en-GB"/>
+        </w:rPr>
+      </w:pPr>
+      <w:r>
+        <w:rPr>
+          <w:lang w:val="en-GB"/>
+        </w:rPr>
+        <w:lastRenderedPageBreak/>
+        <w:t>If it receives 7.4 V from the battery, a duty cycle of 81% will give an effective voltage of 6 V.</w:t>
+      </w:r>
+    </w:p>
+    <w:p>
+      <w:pPr>
+        <w:pStyle w:val="ListParagraph"/>
+        <w:numPr>
+          <w:ilvl w:val="0"/>
+          <w:numId w:val="4"/>
+        </w:numPr>
+        <w:rPr>
+          <w:lang w:val="en-GB"/>
+        </w:rPr>
+      </w:pPr>
+      <w:r>
+        <w:rPr>
+          <w:lang w:val="en-GB"/>
+        </w:rPr>
+        <w:t>I.e. a value of 207</w:t>
+      </w:r>
+    </w:p>
+    <w:p>
+      <w:pPr>
+        <w:pStyle w:val="ListParagraph"/>
+        <w:numPr>
+          <w:ilvl w:val="0"/>
+          <w:numId w:val="4"/>
+        </w:numPr>
+        <w:rPr>
+          <w:lang w:val="en-GB"/>
+        </w:rPr>
+      </w:pPr>
+      <w:r>
+        <w:rPr>
+          <w:lang w:val="en-GB"/>
+        </w:rPr>
+        <w:t>Measure to make sure!</w:t>
+      </w:r>
+    </w:p>
+    <w:p>
+      <w:pPr>
+        <w:rPr>
+          <w:b/>
+          <w:bCs/>
+          <w:lang w:val="en-GB"/>
+        </w:rPr>
+      </w:pPr>
+      <w:r>
+        <w:rPr>
+          <w:b/>
+          <w:bCs/>
+          <w:lang w:val="en-GB"/>
+        </w:rPr>
         <w:t>Control Algorithm</w:t>
       </w:r>
     </w:p>
     <w:p>
       <w:pPr>
-        <w:rPr>
-          <w:lang w:val="en-GB"/>
-        </w:rPr>
-      </w:pPr>
-      <w:r>
-        <w:rPr>
-          <w:lang w:val="en-GB"/>
-        </w:rPr>
-        <w:t>A</w:t>
+        <w:pStyle w:val="ListParagraph"/>
+        <w:numPr>
+          <w:ilvl w:val="0"/>
+          <w:numId w:val="4"/>
+        </w:numPr>
+        <w:rPr>
+          <w:lang w:val="en-GB"/>
+        </w:rPr>
+      </w:pPr>
+      <w:r>
+        <w:rPr>
+          <w:lang w:val="en-GB"/>
+        </w:rPr>
+        <w:t>COM angle is the reference you want to set it to?</w:t>
+      </w:r>
+    </w:p>
+    <w:p>
+      <w:pPr>
+        <w:pStyle w:val="ListParagraph"/>
+        <w:numPr>
+          <w:ilvl w:val="0"/>
+          <w:numId w:val="4"/>
+        </w:numPr>
+        <w:rPr>
+          <w:lang w:val="en-GB"/>
+        </w:rPr>
+      </w:pPr>
+      <w:r>
+        <w:rPr>
+          <w:lang w:val="en-GB"/>
+        </w:rPr>
+        <w:t>Two nested PID loops?</w:t>
       </w:r>
     </w:p>
     <w:p>
@@ -6586,6 +7366,46 @@
           <w:top w:val="single" w:sz="6" w:space="1" w:color="auto"/>
           <w:bottom w:val="single" w:sz="6" w:space="1" w:color="auto"/>
         </w:pBdr>
+        <w:rPr>
+          <w:b/>
+          <w:bCs/>
+          <w:lang w:val="en-GB"/>
+        </w:rPr>
+      </w:pPr>
+      <w:r>
+        <w:rPr>
+          <w:b/>
+          <w:bCs/>
+          <w:lang w:val="en-GB"/>
+        </w:rPr>
+        <w:t>Notes</w:t>
+      </w:r>
+    </w:p>
+    <w:p>
+      <w:pPr>
+        <w:pStyle w:val="ListParagraph"/>
+        <w:numPr>
+          <w:ilvl w:val="0"/>
+          <w:numId w:val="4"/>
+        </w:numPr>
+        <w:pBdr>
+          <w:bottom w:val="single" w:sz="6" w:space="1" w:color="auto"/>
+          <w:between w:val="single" w:sz="6" w:space="1" w:color="auto"/>
+        </w:pBdr>
+        <w:rPr>
+          <w:lang w:val="en-GB"/>
+        </w:rPr>
+      </w:pPr>
+      <w:r>
+        <w:t>Whatever you do, keep the Gyro as close to the middle of the axle as possible and lay it flat with the pins sticking up. don't mount the Gyro halfway up or you will get an error with your readings.</w:t>
+      </w:r>
+    </w:p>
+    <w:p>
+      <w:pPr>
+        <w:pBdr>
+          <w:bottom w:val="single" w:sz="6" w:space="1" w:color="auto"/>
+          <w:between w:val="single" w:sz="6" w:space="1" w:color="auto"/>
+        </w:pBdr>
         <w:tabs>
           <w:tab w:val="left" w:pos="2680"/>
         </w:tabs>
@@ -6609,36 +7429,7 @@
         <w:pStyle w:val="ListParagraph"/>
         <w:numPr>
           <w:ilvl w:val="0"/>
-          <w:numId w:val="6"/>
-        </w:numPr>
-        <w:tabs>
-          <w:tab w:val="left" w:pos="2680"/>
-        </w:tabs>
-        <w:rPr>
-          <w:lang w:val="en-GB"/>
-        </w:rPr>
-      </w:pPr>
-      <w:r>
-        <w:rPr>
-          <w:lang w:val="en-GB"/>
-        </w:rPr>
-        <w:t xml:space="preserve">Does Arduino come with cable? </w:t>
-      </w:r>
-      <w:r>
-        <w:rPr>
-          <w:i/>
-          <w:iCs/>
-          <w:lang w:val="en-GB"/>
-        </w:rPr>
-        <w:t>Phone and ask.</w:t>
-      </w:r>
-    </w:p>
-    <w:p>
-      <w:pPr>
-        <w:pStyle w:val="ListParagraph"/>
-        <w:numPr>
-          <w:ilvl w:val="0"/>
-          <w:numId w:val="6"/>
+          <w:numId w:val="9"/>
         </w:numPr>
         <w:tabs>
           <w:tab w:val="left" w:pos="2680"/>
@@ -8642,6 +9433,18 @@
       <w:u w:val="single"/>
     </w:rPr>
   </w:style>
+  <w:style w:type="character" w:styleId="UnresolvedMention">
+    <w:name w:val="Unresolved Mention"/>
+    <w:basedOn w:val="DefaultParagraphFont"/>
+    <w:uiPriority w:val="99"/>
+    <w:semiHidden/>
+    <w:unhideWhenUsed/>
+    <w:rsid w:val="003A11D2"/>
+    <w:rPr>
+      <w:color w:val="605E5C"/>
+      <w:shd w:val="clear" w:color="auto" w:fill="E1DFDD"/>
+    </w:rPr>
+  </w:style>
 </w:styles>
 </file>
 

</xml_diff>